<commit_message>
Update Week 5 Agent Task Contract
Replaced with revised version that is tightly focused on the five required elements:
- Agent goal for utility service triage
- Allowed tools with permission matrix
- Session state tracking
- Maximum iterations (MAX_ITERATIONS = 3)
- Exact stop conditions with decision table

Removed extra content to focus on individual deliverable scope.

Generated with [Devin](https://devin.ai)

Co-Authored-By: Devin <158243242+devin-ai-integration[bot]@users.noreply.github.com>
</commit_message>
<xml_diff>
--- a/docs/requirements/Agent_Task_Contract for week 5.docx
+++ b/docs/requirements/Agent_Task_Contract for week 5.docx
@@ -1,92 +1,154 @@
 
 <file path=word/document.xml><?xml version="1.0" encoding="utf-8"?>
-<w:document xmlns:wpc="http://schemas.microsoft.com/office/word/2010/wordprocessingCanvas" xmlns:cx="http://schemas.microsoft.com/office/drawing/2014/chartex" xmlns:cx1="http://schemas.microsoft.com/office/drawing/2015/9/8/chartex" xmlns:cx2="http://schemas.microsoft.com/office/drawing/2015/10/21/chartex" xmlns:cx3="http://schemas.microsoft.com/office/drawing/2016/5/9/chartex" xmlns:cx4="http://schemas.microsoft.com/office/drawing/2016/5/10/chartex" xmlns:cx5="http://schemas.microsoft.com/office/drawing/2016/5/11/chartex" xmlns:cx6="http://schemas.microsoft.com/office/drawing/2016/5/12/chartex" xmlns:cx7="http://schemas.microsoft.com/office/drawing/2016/5/13/chartex" xmlns:cx8="http://schemas.microsoft.com/office/drawing/2016/5/14/chartex" xmlns:mc="http://schemas.openxmlformats.org/markup-compatibility/2006" xmlns:aink="http://schemas.microsoft.com/office/drawing/2016/ink" xmlns:am3d="http://schemas.microsoft.com/office/drawing/2017/model3d" xmlns:o="urn:schemas-microsoft-com:office:office" xmlns:r="http://schemas.openxmlformats.org/officeDocument/2006/relationships" xmlns:m="http://schemas.openxmlformats.org/officeDocument/2006/math" xmlns:v="urn:schemas-microsoft-com:vml" xmlns:wp14="http://schemas.microsoft.com/office/word/2010/wordprocessingDrawing" xmlns:wp="http://schemas.openxmlformats.org/drawingml/2006/wordprocessingDrawing" xmlns:w10="urn:schemas-microsoft-com:office:word" xmlns:w="http://schemas.openxmlformats.org/wordprocessingml/2006/main" xmlns:w14="http://schemas.microsoft.com/office/word/2010/wordml" xmlns:w15="http://schemas.microsoft.com/office/word/2012/wordml" xmlns:w16cex="http://schemas.microsoft.com/office/word/2018/wordml/cex" xmlns:w16cid="http://schemas.microsoft.com/office/word/2016/wordml/cid" xmlns:w16="http://schemas.microsoft.com/office/word/2018/wordml" xmlns:w16sdtdh="http://schemas.microsoft.com/office/word/2020/wordml/sdtdatahash" xmlns:w16se="http://schemas.microsoft.com/office/word/2015/wordml/symex" xmlns:wpg="http://schemas.microsoft.com/office/word/2010/wordprocessingGroup" xmlns:wpi="http://schemas.microsoft.com/office/word/2010/wordprocessingInk" xmlns:wne="http://schemas.microsoft.com/office/word/2006/wordml" xmlns:wps="http://schemas.microsoft.com/office/word/2010/wordprocessingShape" mc:Ignorable="w14 w15 w16se w16cid w16 w16cex w16sdtdh wp14">
+<w:document xmlns:wpc="http://schemas.microsoft.com/office/word/2010/wordprocessingCanvas" xmlns:cx="http://schemas.microsoft.com/office/drawing/2014/chartex" xmlns:cx1="http://schemas.microsoft.com/office/drawing/2015/9/8/chartex" xmlns:mc="http://schemas.openxmlformats.org/markup-compatibility/2006" xmlns:o="urn:schemas-microsoft-com:office:office" xmlns:r="http://schemas.openxmlformats.org/officeDocument/2006/relationships" xmlns:m="http://schemas.openxmlformats.org/officeDocument/2006/math" xmlns:v="urn:schemas-microsoft-com:vml" xmlns:wp14="http://schemas.microsoft.com/office/word/2010/wordprocessingDrawing" xmlns:wp="http://schemas.openxmlformats.org/drawingml/2006/wordprocessingDrawing" xmlns:w10="urn:schemas-microsoft-com:office:word" xmlns:w="http://schemas.openxmlformats.org/wordprocessingml/2006/main" xmlns:w14="http://schemas.microsoft.com/office/word/2010/wordml" xmlns:w15="http://schemas.microsoft.com/office/word/2012/wordml" xmlns:w16se="http://schemas.microsoft.com/office/word/2015/wordml/symex" xmlns:wpg="http://schemas.microsoft.com/office/word/2010/wordprocessingGroup" xmlns:wpi="http://schemas.microsoft.com/office/word/2010/wordprocessingInk" xmlns:wne="http://schemas.microsoft.com/office/word/2006/wordml" xmlns:wps="http://schemas.microsoft.com/office/word/2010/wordprocessingShape" mc:Ignorable="w14 w15 w16se wp14">
   <w:body>
     <w:p>
       <w:pPr>
-        <w:pStyle w:val="Title"/>
-      </w:pPr>
-      <w:r>
-        <w:t>Week 5 — Agent Task Contract</w:t>
-      </w:r>
-    </w:p>
-    <w:p>
-      <w:pPr>
-        <w:pStyle w:val="Heading1"/>
-        <w:keepNext/>
-        <w:spacing w:before="240" w:after="120"/>
-      </w:pPr>
-      <w:r>
+        <w:jc w:val="center"/>
+        <w:rPr>
+          <w:b/>
+        </w:rPr>
+      </w:pPr>
+      <w:r>
+        <w:rPr>
+          <w:b/>
+        </w:rPr>
+        <w:t xml:space="preserve">Week 5 - </w:t>
+      </w:r>
+      <w:r>
+        <w:rPr>
+          <w:b/>
+        </w:rPr>
+        <w:t>Agent Task Contract</w:t>
+      </w:r>
+    </w:p>
+    <w:p>
+      <w:pPr>
+        <w:rPr>
+          <w:b/>
+        </w:rPr>
+      </w:pPr>
+      <w:r>
+        <w:rPr>
+          <w:b/>
+        </w:rPr>
         <w:t>Overview</w:t>
       </w:r>
     </w:p>
     <w:p>
       <w:pPr>
-        <w:spacing w:after="100"/>
-      </w:pPr>
-      <w:r>
-        <w:t xml:space="preserve">This contract defines the bounded agent workflow for the </w:t>
+        <w:rPr>
+          <w:b/>
+        </w:rPr>
+      </w:pPr>
+    </w:p>
+    <w:p>
+      <w:r>
+        <w:t>This contract defines the bounded agent workflow for the Utili</w:t>
+      </w:r>
+      <w:r>
+        <w:t>ty</w:t>
+      </w:r>
+      <w:r>
+        <w:t>Care</w:t>
+      </w:r>
+      <w:bookmarkStart w:id="0" w:name="_GoBack"/>
+      <w:bookmarkEnd w:id="0"/>
+      <w:r>
+        <w:t xml:space="preserve"> Help Desk Triage Agent: its goal, tools, state, limits, and stop conditions.</w:t>
+      </w:r>
+    </w:p>
+    <w:p/>
+    <w:p>
+      <w:r>
+        <w:t xml:space="preserve">It specifies the bounded-autonomy design for the Week 5 implementation. It distinguishes the existing Week 4 capabilities (single-shot classification with tools) from the Week 5 controls (explicit Plan-Act-Observe loop, iteration limits, and stop conditions). Features marked as “required” are implementation targets in </w:t>
+      </w:r>
+      <w:r>
+        <w:rPr>
+          <w:rFonts w:eastAsia="Courier New"/>
+        </w:rPr>
+        <w:t>src/agent.py</w:t>
+      </w:r>
+      <w:r>
+        <w:t xml:space="preserve"> and are not claims about the current codebase.</w:t>
+      </w:r>
+    </w:p>
+    <w:p/>
+    <w:p>
+      <w:pPr>
+        <w:rPr>
+          <w:b/>
+        </w:rPr>
+      </w:pPr>
+      <w:r>
+        <w:t xml:space="preserve">1. </w:t>
+      </w:r>
+      <w:r>
+        <w:rPr>
+          <w:b/>
+        </w:rPr>
+        <w:t>Agent Goal</w:t>
+      </w:r>
+    </w:p>
+    <w:p/>
+    <w:p>
+      <w:r>
+        <w:t xml:space="preserve">The agent’s primary goal is to </w:t>
+      </w:r>
+      <w:r>
+        <w:rPr>
+          <w:b/>
+          <w:bCs/>
+        </w:rPr>
+        <w:t>triage customer service requests for electricity and water utilities</w:t>
+      </w:r>
+      <w:r>
+        <w:t xml:space="preserve"> by:</w:t>
+      </w:r>
+    </w:p>
+    <w:p>
+      <w:r>
+        <w:t xml:space="preserve">Classifying the customer’s issue into one of six categories (billing, outage, </w:t>
       </w:r>
       <w:proofErr w:type="spellStart"/>
       <w:r>
-        <w:t>UtiliCare</w:t>
+        <w:t>service_request</w:t>
       </w:r>
       <w:proofErr w:type="spellEnd"/>
       <w:r>
-        <w:t xml:space="preserve"> Help Desk Triage Agent: its goal, tools, state, limits, and stop conditions.</w:t>
-      </w:r>
-    </w:p>
-    <w:p>
-      <w:pPr>
-        <w:spacing w:after="100"/>
-      </w:pPr>
-      <w:r>
-        <w:t>It specifies the bounded-autonomy design for the Week 5 implementation. It distinguishes the existing Week 4 cap</w:t>
-      </w:r>
-      <w:r>
-        <w:t xml:space="preserve">abilities (single-shot classification with tools) from the Week 5 controls (explicit Plan-Act-Observe loop, iteration limits, and stop conditions). Features marked as “required” are implementation targets in </w:t>
-      </w:r>
-      <w:r>
-        <w:rPr>
-          <w:rFonts w:ascii="Courier New" w:eastAsia="Courier New" w:hAnsi="Courier New" w:cs="Courier New"/>
-          <w:sz w:val="22"/>
-          <w:szCs w:val="22"/>
-        </w:rPr>
-        <w:t>src/agent.py</w:t>
-      </w:r>
-      <w:r>
-        <w:t xml:space="preserve"> and are not claims about the curren</w:t>
-      </w:r>
-      <w:r>
-        <w:t>t codebase.</w:t>
-      </w:r>
-    </w:p>
-    <w:p>
-      <w:pPr>
-        <w:pStyle w:val="Heading1"/>
-        <w:keepNext/>
-        <w:spacing w:before="240" w:after="120"/>
-      </w:pPr>
-      <w:r>
-        <w:t>1. Agent Goal</w:t>
-      </w:r>
-    </w:p>
-    <w:p>
-      <w:pPr>
-        <w:spacing w:after="100"/>
-      </w:pPr>
-      <w:r>
-        <w:t xml:space="preserve">The agent’s primary goal is to </w:t>
-      </w:r>
-      <w:r>
+        <w:t>, account, complaint, other).</w:t>
+      </w:r>
+    </w:p>
+    <w:p>
+      <w:r>
+        <w:t>Providing grounded guidance based on the knowledge base.</w:t>
+      </w:r>
+    </w:p>
+    <w:p>
+      <w:r>
+        <w:t>When appropriate, checking outage status and/or drafting a support ticket.</w:t>
+      </w:r>
+    </w:p>
+    <w:p>
+      <w:r>
+        <w:t>Determining when the issue is resolved or requires human intervention.</w:t>
+      </w:r>
+    </w:p>
+    <w:p>
+      <w:pPr>
         <w:rPr>
           <w:b/>
           <w:bCs/>
         </w:rPr>
-        <w:t>triage customer service requests for electricity and water utilities</w:t>
-      </w:r>
-      <w:r>
-        <w:t xml:space="preserve"> by:</w:t>
+      </w:pPr>
+    </w:p>
+    <w:p>
+      <w:r>
+        <w:rPr>
+          <w:b/>
+          <w:bCs/>
+        </w:rPr>
+        <w:t>The agent must never:</w:t>
       </w:r>
     </w:p>
     <w:p>
@@ -94,19 +156,11 @@
         <w:pStyle w:val="ListParagraph"/>
         <w:numPr>
           <w:ilvl w:val="0"/>
-          <w:numId w:val="2"/>
+          <w:numId w:val="9"/>
         </w:numPr>
       </w:pPr>
       <w:r>
-        <w:t xml:space="preserve">Classifying the customer’s issue into one of six categories (billing, outage, </w:t>
-      </w:r>
-      <w:proofErr w:type="spellStart"/>
-      <w:r>
-        <w:t>service_request</w:t>
-      </w:r>
-      <w:proofErr w:type="spellEnd"/>
-      <w:r>
-        <w:t>, account, complaint, other).</w:t>
+        <w:t>Make autonomous decisions about service disconnection or reconnection.</w:t>
       </w:r>
     </w:p>
     <w:p>
@@ -114,14 +168,11 @@
         <w:pStyle w:val="ListParagraph"/>
         <w:numPr>
           <w:ilvl w:val="0"/>
-          <w:numId w:val="2"/>
+          <w:numId w:val="9"/>
         </w:numPr>
       </w:pPr>
       <w:r>
-        <w:t>Pro</w:t>
-      </w:r>
-      <w:r>
-        <w:t>viding grounded guidance based on the knowledge base.</w:t>
+        <w:t>Change billing or make financial commitments.</w:t>
       </w:r>
     </w:p>
     <w:p>
@@ -129,11 +180,11 @@
         <w:pStyle w:val="ListParagraph"/>
         <w:numPr>
           <w:ilvl w:val="0"/>
-          <w:numId w:val="2"/>
+          <w:numId w:val="9"/>
         </w:numPr>
       </w:pPr>
       <w:r>
-        <w:t>When appropriate, checking outage status and/or drafting a support ticket.</w:t>
+        <w:t>Approve, escalate, or close tickets without human review.</w:t>
       </w:r>
     </w:p>
     <w:p>
@@ -141,624 +192,463 @@
         <w:pStyle w:val="ListParagraph"/>
         <w:numPr>
           <w:ilvl w:val="0"/>
-          <w:numId w:val="2"/>
+          <w:numId w:val="9"/>
         </w:numPr>
       </w:pPr>
       <w:r>
-        <w:t>Determining when the issue is resolved or requires human intervention.</w:t>
-      </w:r>
-    </w:p>
-    <w:p>
-      <w:pPr>
-        <w:keepNext/>
-        <w:spacing w:after="100"/>
-      </w:pPr>
+        <w:t>Control infrastructure directly.</w:t>
+      </w:r>
+    </w:p>
+    <w:p/>
+    <w:p>
+      <w:pPr>
+        <w:rPr>
+          <w:b/>
+        </w:rPr>
+      </w:pPr>
+      <w:r>
+        <w:t xml:space="preserve">2. </w:t>
+      </w:r>
+      <w:r>
+        <w:rPr>
+          <w:b/>
+        </w:rPr>
+        <w:t>Allowed Tools</w:t>
+      </w:r>
+    </w:p>
+    <w:p>
+      <w:r>
+        <w:t>The agent is authorized to use exactly two tools.</w:t>
+      </w:r>
+    </w:p>
+    <w:p>
+      <w:pPr>
+        <w:rPr>
+          <w:b/>
+        </w:rPr>
+      </w:pPr>
+      <w:r>
+        <w:rPr>
+          <w:b/>
+        </w:rPr>
+        <w:t xml:space="preserve">a) </w:t>
+      </w:r>
+      <w:r>
+        <w:rPr>
+          <w:b/>
+        </w:rPr>
+        <w:t>get_outage_status</w:t>
+      </w:r>
+    </w:p>
+    <w:p>
       <w:r>
         <w:rPr>
           <w:b/>
           <w:bCs/>
         </w:rPr>
-        <w:t>The agent must never:</w:t>
-      </w:r>
-    </w:p>
-    <w:p>
-      <w:pPr>
-        <w:pStyle w:val="ListParagraph"/>
-        <w:numPr>
-          <w:ilvl w:val="0"/>
-          <w:numId w:val="3"/>
-        </w:numPr>
-      </w:pPr>
-      <w:r>
-        <w:t>Make autonomous decisions about se</w:t>
-      </w:r>
-      <w:r>
-        <w:t>rvice disconnection or reconnection.</w:t>
-      </w:r>
-    </w:p>
-    <w:p>
-      <w:pPr>
-        <w:pStyle w:val="ListParagraph"/>
-        <w:numPr>
-          <w:ilvl w:val="0"/>
-          <w:numId w:val="3"/>
-        </w:numPr>
-      </w:pPr>
-      <w:r>
-        <w:t>Change billing or make financial commitments.</w:t>
-      </w:r>
-    </w:p>
-    <w:p>
-      <w:pPr>
-        <w:pStyle w:val="ListParagraph"/>
-        <w:numPr>
-          <w:ilvl w:val="0"/>
-          <w:numId w:val="3"/>
-        </w:numPr>
-      </w:pPr>
-      <w:r>
-        <w:t>Approve, escalate, or close tickets without human review.</w:t>
-      </w:r>
-    </w:p>
-    <w:p>
-      <w:pPr>
-        <w:pStyle w:val="ListParagraph"/>
-        <w:numPr>
-          <w:ilvl w:val="0"/>
-          <w:numId w:val="3"/>
-        </w:numPr>
-      </w:pPr>
-      <w:r>
-        <w:t>Control infrastructure directly.</w:t>
-      </w:r>
-    </w:p>
-    <w:p>
-      <w:pPr>
-        <w:pStyle w:val="Heading1"/>
-        <w:keepNext/>
-        <w:spacing w:before="240" w:after="120"/>
-      </w:pPr>
-      <w:r>
-        <w:t>2. Allowed Tools</w:t>
-      </w:r>
-    </w:p>
-    <w:p>
-      <w:pPr>
-        <w:spacing w:after="100"/>
-      </w:pPr>
-      <w:r>
-        <w:t>The agent is authorized to use exactly two tools.</w:t>
-      </w:r>
-    </w:p>
-    <w:p>
-      <w:pPr>
-        <w:pStyle w:val="Heading2"/>
-        <w:keepNext/>
-        <w:spacing w:before="180" w:after="80"/>
-      </w:pPr>
-      <w:r>
-        <w:t xml:space="preserve">2.1 </w:t>
+        <w:t>Purpose:</w:t>
+      </w:r>
+      <w:r>
+        <w:t xml:space="preserve"> Check whether a known service outage exists for a customer’s area.</w:t>
+      </w:r>
+    </w:p>
+    <w:p>
+      <w:r>
+        <w:rPr>
+          <w:b/>
+          <w:bCs/>
+        </w:rPr>
+        <w:t>Authorization:</w:t>
+      </w:r>
+      <w:r>
+        <w:t xml:space="preserve"> Read-only, no approval required.</w:t>
+      </w:r>
+    </w:p>
+    <w:p>
+      <w:r>
+        <w:rPr>
+          <w:b/>
+          <w:bCs/>
+        </w:rPr>
+        <w:t>Required parameters:</w:t>
+      </w:r>
+      <w:r>
+        <w:t xml:space="preserve"> </w:t>
       </w:r>
       <w:proofErr w:type="spellStart"/>
       <w:r>
-        <w:t>get_outage_</w:t>
-      </w:r>
-      <w:r>
+        <w:rPr>
+          <w:rFonts w:eastAsia="Courier New"/>
+        </w:rPr>
+        <w:t>area_code</w:t>
+      </w:r>
+      <w:proofErr w:type="spellEnd"/>
+      <w:r>
+        <w:t xml:space="preserve"> (string), </w:t>
+      </w:r>
+      <w:proofErr w:type="spellStart"/>
+      <w:r>
+        <w:rPr>
+          <w:rFonts w:eastAsia="Courier New"/>
+        </w:rPr>
+        <w:t>service_type</w:t>
+      </w:r>
+      <w:proofErr w:type="spellEnd"/>
+      <w:r>
+        <w:t xml:space="preserve"> (</w:t>
+      </w:r>
+      <w:proofErr w:type="spellStart"/>
+      <w:r>
+        <w:t>enum</w:t>
+      </w:r>
+      <w:proofErr w:type="spellEnd"/>
+      <w:r>
+        <w:t>: “electricity” or “water”).</w:t>
+      </w:r>
+    </w:p>
+    <w:p>
+      <w:r>
+        <w:rPr>
+          <w:b/>
+          <w:bCs/>
+        </w:rPr>
+        <w:t>Expected output:</w:t>
+      </w:r>
+      <w:r>
+        <w:t xml:space="preserve"> </w:t>
+      </w:r>
+      <w:proofErr w:type="spellStart"/>
+      <w:r>
+        <w:t>Dict</w:t>
+      </w:r>
+      <w:proofErr w:type="spellEnd"/>
+      <w:r>
+        <w:t xml:space="preserve"> with </w:t>
+      </w:r>
+      <w:proofErr w:type="spellStart"/>
+      <w:r>
+        <w:rPr>
+          <w:rFonts w:eastAsia="Courier New"/>
+        </w:rPr>
+        <w:t>outage_active</w:t>
+      </w:r>
+      <w:proofErr w:type="spellEnd"/>
+      <w:r>
+        <w:t xml:space="preserve">, </w:t>
+      </w:r>
+      <w:proofErr w:type="spellStart"/>
+      <w:r>
+        <w:rPr>
+          <w:rFonts w:eastAsia="Courier New"/>
+        </w:rPr>
+        <w:t>estimated_restoration</w:t>
+      </w:r>
+      <w:proofErr w:type="spellEnd"/>
+      <w:r>
+        <w:t xml:space="preserve">, </w:t>
+      </w:r>
+      <w:proofErr w:type="spellStart"/>
+      <w:r>
+        <w:rPr>
+          <w:rFonts w:eastAsia="Courier New"/>
+        </w:rPr>
+        <w:t>affected_area_description</w:t>
+      </w:r>
+      <w:proofErr w:type="spellEnd"/>
+      <w:r>
+        <w:t>.</w:t>
+      </w:r>
+    </w:p>
+    <w:p>
+      <w:r>
+        <w:rPr>
+          <w:b/>
+          <w:bCs/>
+        </w:rPr>
+        <w:t>Usage condition:</w:t>
+      </w:r>
+      <w:r>
+        <w:t xml:space="preserve"> Call this tool for outage-related issues (</w:t>
+      </w:r>
+      <w:proofErr w:type="spellStart"/>
+      <w:r>
+        <w:t>power_outage</w:t>
+      </w:r>
+      <w:proofErr w:type="spellEnd"/>
+      <w:r>
+        <w:t xml:space="preserve">, </w:t>
+      </w:r>
+      <w:proofErr w:type="spellStart"/>
+      <w:r>
+        <w:t>water_leak</w:t>
+      </w:r>
+      <w:proofErr w:type="spellEnd"/>
+      <w:r>
+        <w:t>) before providing troubleshooting advice.</w:t>
+      </w:r>
+    </w:p>
+    <w:p/>
+    <w:p>
+      <w:r>
+        <w:rPr>
+          <w:b/>
+        </w:rPr>
+        <w:t>b)</w:t>
+      </w:r>
+      <w:r>
+        <w:t xml:space="preserve"> </w:t>
+      </w:r>
+      <w:r>
+        <w:rPr>
+          <w:b/>
+        </w:rPr>
+        <w:t>draft_ticket</w:t>
+      </w:r>
+    </w:p>
+    <w:p>
+      <w:r>
+        <w:rPr>
+          <w:b/>
+          <w:bCs/>
+        </w:rPr>
+        <w:t>Purpose:</w:t>
+      </w:r>
+      <w:r>
+        <w:t xml:space="preserve"> Prepare a structured support ticket from a triaged issue.</w:t>
+      </w:r>
+    </w:p>
+    <w:p>
+      <w:r>
+        <w:rPr>
+          <w:b/>
+          <w:bCs/>
+        </w:rPr>
+        <w:t>Authorization:</w:t>
+      </w:r>
+      <w:r>
+        <w:t xml:space="preserve"> May be called autonomously to create drafts, but submission requires human approval.</w:t>
+      </w:r>
+    </w:p>
+    <w:p>
+      <w:r>
+        <w:rPr>
+          <w:b/>
+          <w:bCs/>
+        </w:rPr>
+        <w:t>Required parameters:</w:t>
+      </w:r>
+      <w:r>
+        <w:t xml:space="preserve"> </w:t>
+      </w:r>
+      <w:r>
+        <w:rPr>
+          <w:rFonts w:eastAsia="Courier New"/>
+        </w:rPr>
+        <w:t>category</w:t>
+      </w:r>
+      <w:r>
+        <w:t xml:space="preserve"> (</w:t>
+      </w:r>
+      <w:proofErr w:type="spellStart"/>
+      <w:r>
+        <w:t>enum</w:t>
+      </w:r>
+      <w:proofErr w:type="spellEnd"/>
+      <w:r>
+        <w:t xml:space="preserve">), </w:t>
+      </w:r>
+      <w:r>
+        <w:rPr>
+          <w:rFonts w:eastAsia="Courier New"/>
+        </w:rPr>
+        <w:t>priority</w:t>
+      </w:r>
+      <w:r>
+        <w:t xml:space="preserve"> (</w:t>
+      </w:r>
+      <w:proofErr w:type="spellStart"/>
+      <w:r>
+        <w:t>enum</w:t>
+      </w:r>
+      <w:proofErr w:type="spellEnd"/>
+      <w:r>
+        <w:t xml:space="preserve">), </w:t>
+      </w:r>
+      <w:r>
+        <w:rPr>
+          <w:rFonts w:eastAsia="Courier New"/>
+        </w:rPr>
+        <w:t>summary</w:t>
+      </w:r>
+      <w:r>
+        <w:t xml:space="preserve"> (string), </w:t>
+      </w:r>
+      <w:proofErr w:type="spellStart"/>
+      <w:r>
+        <w:rPr>
+          <w:rFonts w:eastAsia="Courier New"/>
+        </w:rPr>
+        <w:t>customer_area_code</w:t>
+      </w:r>
+      <w:proofErr w:type="spellEnd"/>
+      <w:r>
+        <w:t xml:space="preserve"> (string).</w:t>
+      </w:r>
+    </w:p>
+    <w:p>
+      <w:r>
+        <w:rPr>
+          <w:b/>
+          <w:bCs/>
+        </w:rPr>
+        <w:t>Optional parameters:</w:t>
+      </w:r>
+      <w:r>
+        <w:t xml:space="preserve"> </w:t>
+      </w:r>
+      <w:proofErr w:type="spellStart"/>
+      <w:r>
+        <w:rPr>
+          <w:rFonts w:eastAsia="Courier New"/>
+        </w:rPr>
+        <w:t>recommended_action</w:t>
+      </w:r>
+      <w:proofErr w:type="spellEnd"/>
+      <w:r>
+        <w:t xml:space="preserve"> (string).</w:t>
+      </w:r>
+    </w:p>
+    <w:p>
+      <w:r>
+        <w:rPr>
+          <w:b/>
+          <w:bCs/>
+        </w:rPr>
+        <w:t>Expected output:</w:t>
+      </w:r>
+      <w:r>
+        <w:t xml:space="preserve"> </w:t>
+      </w:r>
+      <w:proofErr w:type="spellStart"/>
+      <w:r>
+        <w:t>Dict</w:t>
+      </w:r>
+      <w:proofErr w:type="spellEnd"/>
+      <w:r>
+        <w:t xml:space="preserve"> with </w:t>
+      </w:r>
+      <w:proofErr w:type="spellStart"/>
+      <w:r>
+        <w:rPr>
+          <w:rFonts w:eastAsia="Courier New"/>
+        </w:rPr>
+        <w:t>draft_id</w:t>
+      </w:r>
+      <w:proofErr w:type="spellEnd"/>
+      <w:r>
+        <w:t xml:space="preserve">, </w:t>
+      </w:r>
+      <w:r>
+        <w:rPr>
+          <w:rFonts w:eastAsia="Courier New"/>
+        </w:rPr>
         <w:t>status</w:t>
       </w:r>
+      <w:r>
+        <w:t xml:space="preserve"> (always “</w:t>
+      </w:r>
+      <w:proofErr w:type="spellStart"/>
+      <w:r>
+        <w:t>pending_approval</w:t>
+      </w:r>
       <w:proofErr w:type="spellEnd"/>
-    </w:p>
-    <w:p>
-      <w:pPr>
-        <w:pStyle w:val="ListParagraph"/>
-        <w:numPr>
-          <w:ilvl w:val="0"/>
-          <w:numId w:val="3"/>
-        </w:numPr>
-      </w:pPr>
+      <w:r>
+        <w:t xml:space="preserve">”), </w:t>
+      </w:r>
+      <w:proofErr w:type="spellStart"/>
+      <w:r>
+        <w:rPr>
+          <w:rFonts w:eastAsia="Courier New"/>
+        </w:rPr>
+        <w:t>draft_summary</w:t>
+      </w:r>
+      <w:proofErr w:type="spellEnd"/>
+      <w:r>
+        <w:t>.</w:t>
+      </w:r>
+    </w:p>
+    <w:p>
       <w:r>
         <w:rPr>
           <w:b/>
           <w:bCs/>
         </w:rPr>
-        <w:t>Purpose:</w:t>
-      </w:r>
-      <w:r>
-        <w:t xml:space="preserve"> Check whether a known service outage exists for a customer’s area.</w:t>
-      </w:r>
-    </w:p>
-    <w:p>
-      <w:pPr>
-        <w:pStyle w:val="ListParagraph"/>
-        <w:numPr>
-          <w:ilvl w:val="0"/>
-          <w:numId w:val="3"/>
-        </w:numPr>
-      </w:pPr>
+        <w:lastRenderedPageBreak/>
+        <w:t>Usage condition:</w:t>
+      </w:r>
+      <w:r>
+        <w:t xml:space="preserve"> Call this tool after classification and guidance for issues requiring human follow-up.</w:t>
+      </w:r>
+    </w:p>
+    <w:p>
       <w:r>
         <w:rPr>
           <w:b/>
           <w:bCs/>
         </w:rPr>
-        <w:t>Authorization:</w:t>
-      </w:r>
-      <w:r>
-        <w:t xml:space="preserve"> Read-only, no approval required.</w:t>
-      </w:r>
-    </w:p>
-    <w:p>
-      <w:pPr>
-        <w:pStyle w:val="ListParagraph"/>
-        <w:numPr>
-          <w:ilvl w:val="0"/>
-          <w:numId w:val="3"/>
-        </w:numPr>
-      </w:pPr>
-      <w:r>
-        <w:rPr>
-          <w:b/>
-          <w:bCs/>
-        </w:rPr>
-        <w:t>Required parameters:</w:t>
+        <w:t>Safety boundary:</w:t>
+      </w:r>
+      <w:r>
+        <w:t xml:space="preserve"> Never call for billing queries or account issues unless explicitly needed.</w:t>
+      </w:r>
+    </w:p>
+    <w:p/>
+    <w:p>
+      <w:r>
+        <w:rPr>
+          <w:b/>
+        </w:rPr>
+        <w:t>c)</w:t>
       </w:r>
       <w:r>
         <w:t xml:space="preserve"> </w:t>
       </w:r>
-      <w:proofErr w:type="spellStart"/>
-      <w:r>
-        <w:rPr>
-          <w:rFonts w:ascii="Courier New" w:eastAsia="Courier New" w:hAnsi="Courier New" w:cs="Courier New"/>
-          <w:sz w:val="22"/>
-          <w:szCs w:val="22"/>
-        </w:rPr>
-        <w:t>area_code</w:t>
-      </w:r>
-      <w:proofErr w:type="spellEnd"/>
-      <w:r>
-        <w:t xml:space="preserve"> (string), </w:t>
-      </w:r>
-      <w:proofErr w:type="spellStart"/>
-      <w:r>
-        <w:rPr>
-          <w:rFonts w:ascii="Courier New" w:eastAsia="Courier New" w:hAnsi="Courier New" w:cs="Courier New"/>
-          <w:sz w:val="22"/>
-          <w:szCs w:val="22"/>
-        </w:rPr>
-        <w:t>service_type</w:t>
-      </w:r>
-      <w:proofErr w:type="spellEnd"/>
-      <w:r>
-        <w:t xml:space="preserve"> (</w:t>
-      </w:r>
-      <w:proofErr w:type="spellStart"/>
-      <w:r>
-        <w:t>enum</w:t>
-      </w:r>
-      <w:proofErr w:type="spellEnd"/>
-      <w:r>
-        <w:t>: “electricity” or “water”).</w:t>
-      </w:r>
-    </w:p>
-    <w:p>
-      <w:pPr>
-        <w:pStyle w:val="ListParagraph"/>
-        <w:numPr>
-          <w:ilvl w:val="0"/>
-          <w:numId w:val="3"/>
-        </w:numPr>
-      </w:pPr>
-      <w:r>
-        <w:rPr>
-          <w:b/>
-          <w:bCs/>
-        </w:rPr>
-        <w:t>Expected output:</w:t>
+      <w:r>
+        <w:rPr>
+          <w:b/>
+        </w:rPr>
+        <w:t>Tool Allow-List</w:t>
+      </w:r>
+    </w:p>
+    <w:p>
+      <w:r>
+        <w:t>No other tools may be used. Any attempt to call an unregistered tool must result in immediate rejection and error logging.</w:t>
+      </w:r>
+    </w:p>
+    <w:p/>
+    <w:p>
+      <w:pPr>
+        <w:rPr>
+          <w:b/>
+        </w:rPr>
+      </w:pPr>
+      <w:r>
+        <w:rPr>
+          <w:b/>
+        </w:rPr>
+        <w:t>d)</w:t>
       </w:r>
       <w:r>
         <w:t xml:space="preserve"> </w:t>
       </w:r>
-      <w:proofErr w:type="spellStart"/>
-      <w:r>
-        <w:t>Dict</w:t>
-      </w:r>
-      <w:proofErr w:type="spellEnd"/>
-      <w:r>
-        <w:t xml:space="preserve"> with </w:t>
-      </w:r>
-      <w:proofErr w:type="spellStart"/>
-      <w:r>
-        <w:rPr>
-          <w:rFonts w:ascii="Courier New" w:eastAsia="Courier New" w:hAnsi="Courier New" w:cs="Courier New"/>
-          <w:sz w:val="22"/>
-          <w:szCs w:val="22"/>
-        </w:rPr>
-        <w:t>outage_act</w:t>
-      </w:r>
-      <w:r>
-        <w:rPr>
-          <w:rFonts w:ascii="Courier New" w:eastAsia="Courier New" w:hAnsi="Courier New" w:cs="Courier New"/>
-          <w:sz w:val="22"/>
-          <w:szCs w:val="22"/>
-        </w:rPr>
-        <w:t>ive</w:t>
-      </w:r>
-      <w:proofErr w:type="spellEnd"/>
-      <w:r>
-        <w:t xml:space="preserve">, </w:t>
-      </w:r>
-      <w:proofErr w:type="spellStart"/>
-      <w:r>
-        <w:rPr>
-          <w:rFonts w:ascii="Courier New" w:eastAsia="Courier New" w:hAnsi="Courier New" w:cs="Courier New"/>
-          <w:sz w:val="22"/>
-          <w:szCs w:val="22"/>
-        </w:rPr>
-        <w:t>estimated_restoration</w:t>
-      </w:r>
-      <w:proofErr w:type="spellEnd"/>
-      <w:r>
-        <w:t xml:space="preserve">, </w:t>
-      </w:r>
-      <w:proofErr w:type="spellStart"/>
-      <w:r>
-        <w:rPr>
-          <w:rFonts w:ascii="Courier New" w:eastAsia="Courier New" w:hAnsi="Courier New" w:cs="Courier New"/>
-          <w:sz w:val="22"/>
-          <w:szCs w:val="22"/>
-        </w:rPr>
-        <w:t>affected_area_description</w:t>
-      </w:r>
-      <w:proofErr w:type="spellEnd"/>
-      <w:r>
-        <w:t>.</w:t>
-      </w:r>
-    </w:p>
-    <w:p>
-      <w:pPr>
-        <w:pStyle w:val="ListParagraph"/>
-        <w:numPr>
-          <w:ilvl w:val="0"/>
-          <w:numId w:val="3"/>
-        </w:numPr>
-      </w:pPr>
-      <w:r>
-        <w:rPr>
-          <w:b/>
-          <w:bCs/>
-        </w:rPr>
-        <w:t>Usage condition:</w:t>
-      </w:r>
-      <w:r>
-        <w:t xml:space="preserve"> Call this tool for outage-related issues (</w:t>
-      </w:r>
-      <w:proofErr w:type="spellStart"/>
-      <w:r>
-        <w:t>power_outage</w:t>
-      </w:r>
-      <w:proofErr w:type="spellEnd"/>
-      <w:r>
-        <w:t xml:space="preserve">, </w:t>
-      </w:r>
-      <w:proofErr w:type="spellStart"/>
-      <w:r>
-        <w:t>water_leak</w:t>
-      </w:r>
-      <w:proofErr w:type="spellEnd"/>
-      <w:r>
-        <w:t>) before providing troubleshooting advice.</w:t>
-      </w:r>
-    </w:p>
-    <w:p>
-      <w:pPr>
-        <w:pStyle w:val="Heading2"/>
-        <w:keepNext/>
-        <w:spacing w:before="180" w:after="80"/>
-      </w:pPr>
-      <w:r>
-        <w:t xml:space="preserve">2.2 </w:t>
-      </w:r>
-      <w:proofErr w:type="spellStart"/>
-      <w:r>
-        <w:t>draft_ticket</w:t>
-      </w:r>
-      <w:proofErr w:type="spellEnd"/>
-    </w:p>
-    <w:p>
-      <w:pPr>
-        <w:pStyle w:val="ListParagraph"/>
-        <w:numPr>
-          <w:ilvl w:val="0"/>
-          <w:numId w:val="3"/>
-        </w:numPr>
-      </w:pPr>
-      <w:r>
-        <w:rPr>
-          <w:b/>
-          <w:bCs/>
-        </w:rPr>
-        <w:t>Purpose:</w:t>
-      </w:r>
-      <w:r>
-        <w:t xml:space="preserve"> Prepare a structured support ticket from a triage</w:t>
-      </w:r>
-      <w:r>
-        <w:t>d issue.</w:t>
-      </w:r>
-    </w:p>
-    <w:p>
-      <w:pPr>
-        <w:pStyle w:val="ListParagraph"/>
-        <w:numPr>
-          <w:ilvl w:val="0"/>
-          <w:numId w:val="3"/>
-        </w:numPr>
-      </w:pPr>
-      <w:r>
-        <w:rPr>
-          <w:b/>
-          <w:bCs/>
-        </w:rPr>
-        <w:t>Authorization:</w:t>
-      </w:r>
-      <w:r>
-        <w:t xml:space="preserve"> May be called autonomously to create drafts, but submission requires human approval.</w:t>
-      </w:r>
-    </w:p>
-    <w:p>
-      <w:pPr>
-        <w:pStyle w:val="ListParagraph"/>
-        <w:numPr>
-          <w:ilvl w:val="0"/>
-          <w:numId w:val="3"/>
-        </w:numPr>
-      </w:pPr>
-      <w:r>
-        <w:rPr>
-          <w:b/>
-          <w:bCs/>
-        </w:rPr>
-        <w:t>Required parameters:</w:t>
-      </w:r>
-      <w:r>
-        <w:t xml:space="preserve"> </w:t>
-      </w:r>
-      <w:r>
-        <w:rPr>
-          <w:rFonts w:ascii="Courier New" w:eastAsia="Courier New" w:hAnsi="Courier New" w:cs="Courier New"/>
-          <w:sz w:val="22"/>
-          <w:szCs w:val="22"/>
-        </w:rPr>
-        <w:t>category</w:t>
-      </w:r>
-      <w:r>
-        <w:t xml:space="preserve"> (</w:t>
-      </w:r>
-      <w:proofErr w:type="spellStart"/>
-      <w:r>
-        <w:t>enum</w:t>
-      </w:r>
-      <w:proofErr w:type="spellEnd"/>
-      <w:r>
-        <w:t xml:space="preserve">), </w:t>
-      </w:r>
-      <w:r>
-        <w:rPr>
-          <w:rFonts w:ascii="Courier New" w:eastAsia="Courier New" w:hAnsi="Courier New" w:cs="Courier New"/>
-          <w:sz w:val="22"/>
-          <w:szCs w:val="22"/>
-        </w:rPr>
-        <w:t>priority</w:t>
-      </w:r>
-      <w:r>
-        <w:t xml:space="preserve"> (</w:t>
-      </w:r>
-      <w:proofErr w:type="spellStart"/>
-      <w:r>
-        <w:t>enum</w:t>
-      </w:r>
-      <w:proofErr w:type="spellEnd"/>
-      <w:r>
-        <w:t xml:space="preserve">), </w:t>
-      </w:r>
-      <w:r>
-        <w:rPr>
-          <w:rFonts w:ascii="Courier New" w:eastAsia="Courier New" w:hAnsi="Courier New" w:cs="Courier New"/>
-          <w:sz w:val="22"/>
-          <w:szCs w:val="22"/>
-        </w:rPr>
-        <w:t>summary</w:t>
-      </w:r>
-      <w:r>
-        <w:t xml:space="preserve"> (string), </w:t>
-      </w:r>
-      <w:proofErr w:type="spellStart"/>
-      <w:r>
-        <w:rPr>
-          <w:rFonts w:ascii="Courier New" w:eastAsia="Courier New" w:hAnsi="Courier New" w:cs="Courier New"/>
-          <w:sz w:val="22"/>
-          <w:szCs w:val="22"/>
-        </w:rPr>
-        <w:t>customer_area_code</w:t>
-      </w:r>
-      <w:proofErr w:type="spellEnd"/>
-      <w:r>
-        <w:t xml:space="preserve"> (string).</w:t>
-      </w:r>
-    </w:p>
-    <w:p>
-      <w:pPr>
-        <w:pStyle w:val="ListParagraph"/>
-        <w:numPr>
-          <w:ilvl w:val="0"/>
-          <w:numId w:val="3"/>
-        </w:numPr>
-      </w:pPr>
-      <w:r>
-        <w:rPr>
-          <w:b/>
-          <w:bCs/>
-        </w:rPr>
-        <w:lastRenderedPageBreak/>
-        <w:t>Optional parameters:</w:t>
-      </w:r>
-      <w:r>
-        <w:t xml:space="preserve"> </w:t>
-      </w:r>
-      <w:proofErr w:type="spellStart"/>
-      <w:r>
-        <w:rPr>
-          <w:rFonts w:ascii="Courier New" w:eastAsia="Courier New" w:hAnsi="Courier New" w:cs="Courier New"/>
-          <w:sz w:val="22"/>
-          <w:szCs w:val="22"/>
-        </w:rPr>
-        <w:t>recommended_action</w:t>
-      </w:r>
-      <w:proofErr w:type="spellEnd"/>
-      <w:r>
-        <w:t xml:space="preserve"> (string).</w:t>
-      </w:r>
-    </w:p>
-    <w:p>
-      <w:pPr>
-        <w:pStyle w:val="ListParagraph"/>
-        <w:numPr>
-          <w:ilvl w:val="0"/>
-          <w:numId w:val="3"/>
-        </w:numPr>
-      </w:pPr>
-      <w:r>
-        <w:rPr>
-          <w:b/>
-          <w:bCs/>
-        </w:rPr>
-        <w:t>Expected output:</w:t>
-      </w:r>
-      <w:r>
-        <w:t xml:space="preserve"> </w:t>
-      </w:r>
-      <w:proofErr w:type="spellStart"/>
-      <w:r>
-        <w:t>Dict</w:t>
-      </w:r>
-      <w:proofErr w:type="spellEnd"/>
-      <w:r>
-        <w:t xml:space="preserve"> with </w:t>
-      </w:r>
-      <w:proofErr w:type="spellStart"/>
-      <w:r>
-        <w:rPr>
-          <w:rFonts w:ascii="Courier New" w:eastAsia="Courier New" w:hAnsi="Courier New" w:cs="Courier New"/>
-          <w:sz w:val="22"/>
-          <w:szCs w:val="22"/>
-        </w:rPr>
-        <w:t>draft_id</w:t>
-      </w:r>
-      <w:proofErr w:type="spellEnd"/>
-      <w:r>
-        <w:t xml:space="preserve">, </w:t>
-      </w:r>
-      <w:r>
-        <w:rPr>
-          <w:rFonts w:ascii="Courier New" w:eastAsia="Courier New" w:hAnsi="Courier New" w:cs="Courier New"/>
-          <w:sz w:val="22"/>
-          <w:szCs w:val="22"/>
-        </w:rPr>
-        <w:t>status</w:t>
-      </w:r>
-      <w:r>
-        <w:t xml:space="preserve"> (always “</w:t>
-      </w:r>
-      <w:proofErr w:type="spellStart"/>
-      <w:r>
-        <w:t>pending_approval</w:t>
-      </w:r>
-      <w:proofErr w:type="spellEnd"/>
-      <w:r>
-        <w:t xml:space="preserve">”), </w:t>
-      </w:r>
-      <w:proofErr w:type="spellStart"/>
-      <w:r>
-        <w:rPr>
-          <w:rFonts w:ascii="Courier New" w:eastAsia="Courier New" w:hAnsi="Courier New" w:cs="Courier New"/>
-          <w:sz w:val="22"/>
-          <w:szCs w:val="22"/>
-        </w:rPr>
-        <w:t>draft_summary</w:t>
-      </w:r>
-      <w:proofErr w:type="spellEnd"/>
-      <w:r>
-        <w:t>.</w:t>
-      </w:r>
-    </w:p>
-    <w:p>
-      <w:pPr>
-        <w:pStyle w:val="ListParagraph"/>
-        <w:numPr>
-          <w:ilvl w:val="0"/>
-          <w:numId w:val="3"/>
-        </w:numPr>
-      </w:pPr>
-      <w:r>
-        <w:rPr>
-          <w:b/>
-          <w:bCs/>
-        </w:rPr>
-        <w:t>Usage condition:</w:t>
-      </w:r>
-      <w:r>
-        <w:t xml:space="preserve"> Call this tool after classification and guidance for issues requiring human follow-up.</w:t>
-      </w:r>
-    </w:p>
-    <w:p>
-      <w:pPr>
-        <w:pStyle w:val="ListParagraph"/>
-        <w:numPr>
-          <w:ilvl w:val="0"/>
-          <w:numId w:val="3"/>
-        </w:numPr>
-      </w:pPr>
-      <w:r>
-        <w:rPr>
-          <w:b/>
-          <w:bCs/>
-        </w:rPr>
-        <w:t>Safety boundary:</w:t>
-      </w:r>
-      <w:r>
-        <w:t xml:space="preserve"> Never call for bil</w:t>
-      </w:r>
-      <w:r>
-        <w:t>ling queries or account issues unless explicitly needed.</w:t>
-      </w:r>
-    </w:p>
-    <w:p>
-      <w:pPr>
-        <w:pStyle w:val="Heading2"/>
-        <w:keepNext/>
-        <w:spacing w:before="180" w:after="80"/>
-      </w:pPr>
-      <w:r>
-        <w:t>2.3 Tool Allow-List</w:t>
-      </w:r>
-    </w:p>
-    <w:p>
-      <w:pPr>
-        <w:spacing w:after="100"/>
-      </w:pPr>
-      <w:r>
-        <w:t>No other tools may be used. Any attempt to call an unregistered tool must result in immediate rejection and error logging.</w:t>
-      </w:r>
-    </w:p>
-    <w:p>
-      <w:pPr>
-        <w:pStyle w:val="Heading2"/>
-        <w:keepNext/>
-        <w:spacing w:before="180" w:after="80"/>
-      </w:pPr>
-      <w:r>
-        <w:t>2.4 Tool Permission Matrix</w:t>
-      </w:r>
-    </w:p>
+      <w:r>
+        <w:rPr>
+          <w:b/>
+        </w:rPr>
+        <w:t>Tool Permission Matrix</w:t>
+      </w:r>
+    </w:p>
+    <w:p/>
     <w:tbl>
       <w:tblPr>
         <w:tblW w:w="9360" w:type="dxa"/>
@@ -783,12 +673,6 @@
         <w:gridCol w:w="3000"/>
       </w:tblGrid>
       <w:tr>
-        <w:tblPrEx>
-          <w:tblCellMar>
-            <w:top w:w="0" w:type="dxa"/>
-            <w:bottom w:w="0" w:type="dxa"/>
-          </w:tblCellMar>
-        </w:tblPrEx>
         <w:trPr>
           <w:cantSplit/>
           <w:tblHeader/>
@@ -802,7 +686,7 @@
               <w:bottom w:val="single" w:sz="4" w:space="0" w:color="000000"/>
               <w:right w:val="single" w:sz="4" w:space="0" w:color="000000"/>
             </w:tcBorders>
-            <w:shd w:val="clear" w:color="auto" w:fill="D9D9D9"/>
+            <w:shd w:val="clear" w:color="auto" w:fill="FFFFFF" w:themeFill="background1"/>
             <w:tcMar>
               <w:top w:w="60" w:type="dxa"/>
               <w:left w:w="100" w:type="dxa"/>
@@ -815,8 +699,6 @@
               <w:rPr>
                 <w:b/>
                 <w:bCs/>
-                <w:sz w:val="22"/>
-                <w:szCs w:val="22"/>
               </w:rPr>
               <w:t>Tool</w:t>
             </w:r>
@@ -831,7 +713,7 @@
               <w:bottom w:val="single" w:sz="4" w:space="0" w:color="000000"/>
               <w:right w:val="single" w:sz="4" w:space="0" w:color="000000"/>
             </w:tcBorders>
-            <w:shd w:val="clear" w:color="auto" w:fill="D9D9D9"/>
+            <w:shd w:val="clear" w:color="auto" w:fill="FFFFFF" w:themeFill="background1"/>
             <w:tcMar>
               <w:top w:w="60" w:type="dxa"/>
               <w:left w:w="100" w:type="dxa"/>
@@ -844,8 +726,6 @@
               <w:rPr>
                 <w:b/>
                 <w:bCs/>
-                <w:sz w:val="22"/>
-                <w:szCs w:val="22"/>
               </w:rPr>
               <w:t>Agent may call?</w:t>
             </w:r>
@@ -860,7 +740,7 @@
               <w:bottom w:val="single" w:sz="4" w:space="0" w:color="000000"/>
               <w:right w:val="single" w:sz="4" w:space="0" w:color="000000"/>
             </w:tcBorders>
-            <w:shd w:val="clear" w:color="auto" w:fill="D9D9D9"/>
+            <w:shd w:val="clear" w:color="auto" w:fill="FFFFFF" w:themeFill="background1"/>
             <w:tcMar>
               <w:top w:w="60" w:type="dxa"/>
               <w:left w:w="100" w:type="dxa"/>
@@ -873,19 +753,8 @@
               <w:rPr>
                 <w:b/>
                 <w:bCs/>
-                <w:sz w:val="22"/>
-                <w:szCs w:val="22"/>
               </w:rPr>
-              <w:t>Human ap</w:t>
-            </w:r>
-            <w:r>
-              <w:rPr>
-                <w:b/>
-                <w:bCs/>
-                <w:sz w:val="22"/>
-                <w:szCs w:val="22"/>
-              </w:rPr>
-              <w:t>proval before call?</w:t>
+              <w:t>Human approval before call?</w:t>
             </w:r>
           </w:p>
         </w:tc>
@@ -898,7 +767,7 @@
               <w:bottom w:val="single" w:sz="4" w:space="0" w:color="000000"/>
               <w:right w:val="single" w:sz="4" w:space="0" w:color="000000"/>
             </w:tcBorders>
-            <w:shd w:val="clear" w:color="auto" w:fill="D9D9D9"/>
+            <w:shd w:val="clear" w:color="auto" w:fill="FFFFFF" w:themeFill="background1"/>
             <w:tcMar>
               <w:top w:w="60" w:type="dxa"/>
               <w:left w:w="100" w:type="dxa"/>
@@ -911,8 +780,6 @@
               <w:rPr>
                 <w:b/>
                 <w:bCs/>
-                <w:sz w:val="22"/>
-                <w:szCs w:val="22"/>
               </w:rPr>
               <w:t>Effect</w:t>
             </w:r>
@@ -920,12 +787,6 @@
         </w:tc>
       </w:tr>
       <w:tr>
-        <w:tblPrEx>
-          <w:tblCellMar>
-            <w:top w:w="0" w:type="dxa"/>
-            <w:bottom w:w="0" w:type="dxa"/>
-          </w:tblCellMar>
-        </w:tblPrEx>
         <w:trPr>
           <w:cantSplit/>
         </w:trPr>
@@ -946,16 +807,12 @@
             </w:tcMar>
           </w:tcPr>
           <w:p>
-            <w:proofErr w:type="spellStart"/>
             <w:r>
               <w:rPr>
-                <w:rFonts w:ascii="Courier New" w:eastAsia="Courier New" w:hAnsi="Courier New" w:cs="Courier New"/>
-                <w:sz w:val="22"/>
-                <w:szCs w:val="22"/>
+                <w:rFonts w:eastAsia="Courier New"/>
               </w:rPr>
               <w:t>get_outage_status</w:t>
             </w:r>
-            <w:proofErr w:type="spellEnd"/>
           </w:p>
         </w:tc>
         <w:tc>
@@ -1026,12 +883,6 @@
         </w:tc>
       </w:tr>
       <w:tr>
-        <w:tblPrEx>
-          <w:tblCellMar>
-            <w:top w:w="0" w:type="dxa"/>
-            <w:bottom w:w="0" w:type="dxa"/>
-          </w:tblCellMar>
-        </w:tblPrEx>
         <w:trPr>
           <w:cantSplit/>
         </w:trPr>
@@ -1052,16 +903,12 @@
             </w:tcMar>
           </w:tcPr>
           <w:p>
-            <w:proofErr w:type="spellStart"/>
             <w:r>
               <w:rPr>
-                <w:rFonts w:ascii="Courier New" w:eastAsia="Courier New" w:hAnsi="Courier New" w:cs="Courier New"/>
-                <w:sz w:val="22"/>
-                <w:szCs w:val="22"/>
+                <w:rFonts w:eastAsia="Courier New"/>
               </w:rPr>
               <w:t>draft_ticket</w:t>
             </w:r>
-            <w:proofErr w:type="spellEnd"/>
           </w:p>
         </w:tc>
         <w:tc>
@@ -1140,12 +987,6 @@
         </w:tc>
       </w:tr>
       <w:tr>
-        <w:tblPrEx>
-          <w:tblCellMar>
-            <w:top w:w="0" w:type="dxa"/>
-            <w:bottom w:w="0" w:type="dxa"/>
-          </w:tblCellMar>
-        </w:tblPrEx>
         <w:trPr>
           <w:cantSplit/>
         </w:trPr>
@@ -1239,12 +1080,6 @@
         </w:tc>
       </w:tr>
       <w:tr>
-        <w:tblPrEx>
-          <w:tblCellMar>
-            <w:top w:w="0" w:type="dxa"/>
-            <w:bottom w:w="0" w:type="dxa"/>
-          </w:tblCellMar>
-        </w:tblPrEx>
         <w:trPr>
           <w:cantSplit/>
         </w:trPr>
@@ -1338,12 +1173,6 @@
         </w:tc>
       </w:tr>
       <w:tr>
-        <w:tblPrEx>
-          <w:tblCellMar>
-            <w:top w:w="0" w:type="dxa"/>
-            <w:bottom w:w="0" w:type="dxa"/>
-          </w:tblCellMar>
-        </w:tblPrEx>
         <w:trPr>
           <w:cantSplit/>
         </w:trPr>
@@ -1437,12 +1266,6 @@
         </w:tc>
       </w:tr>
       <w:tr>
-        <w:tblPrEx>
-          <w:tblCellMar>
-            <w:top w:w="0" w:type="dxa"/>
-            <w:bottom w:w="0" w:type="dxa"/>
-          </w:tblCellMar>
-        </w:tblPrEx>
         <w:trPr>
           <w:cantSplit/>
         </w:trPr>
@@ -1536,15 +1359,8 @@
         </w:tc>
       </w:tr>
     </w:tbl>
-    <w:p>
-      <w:pPr>
-        <w:spacing w:after="100"/>
-      </w:pPr>
-    </w:p>
-    <w:p>
-      <w:pPr>
-        <w:spacing w:after="100"/>
-      </w:pPr>
+    <w:p/>
+    <w:p>
       <w:r>
         <w:rPr>
           <w:b/>
@@ -1553,58 +1369,70 @@
         <w:t>Key architectural distinction:</w:t>
       </w:r>
       <w:r>
-        <w:t xml:space="preserve"> The agent can prepare an action (draft a ticket) without being authorized to execute the consequential action (submit the ticket</w:t>
-      </w:r>
-      <w:r>
-        <w:t>). This separation ensures human oversight for high-impact decisions.</w:t>
-      </w:r>
-    </w:p>
-    <w:p>
-      <w:pPr>
-        <w:pStyle w:val="Heading1"/>
-        <w:keepNext/>
-        <w:spacing w:before="240" w:after="120"/>
-      </w:pPr>
-      <w:r>
+        <w:t xml:space="preserve"> The agent can prepare an action (draft a ticket) without being authorized to execute the consequential action (submit the ticket). This separation ensures human oversight for high-impact decisions.</w:t>
+      </w:r>
+    </w:p>
+    <w:p/>
+    <w:p>
+      <w:pPr>
+        <w:rPr>
+          <w:b/>
+        </w:rPr>
+      </w:pPr>
+      <w:r>
+        <w:rPr>
+          <w:b/>
+        </w:rPr>
         <w:t>3. Agent State</w:t>
       </w:r>
     </w:p>
-    <w:p>
-      <w:pPr>
-        <w:spacing w:after="100"/>
-      </w:pPr>
+    <w:p/>
+    <w:p>
       <w:r>
         <w:t>The agent tracks the following state between workflow steps.</w:t>
       </w:r>
     </w:p>
     <w:p>
       <w:pPr>
-        <w:pStyle w:val="Heading2"/>
-        <w:keepNext/>
-        <w:spacing w:before="180" w:after="80"/>
-      </w:pPr>
-      <w:r>
+        <w:rPr>
+          <w:b/>
+        </w:rPr>
+      </w:pPr>
+    </w:p>
+    <w:p>
+      <w:pPr>
+        <w:rPr>
+          <w:b/>
+        </w:rPr>
+      </w:pPr>
+      <w:r>
+        <w:rPr>
+          <w:b/>
+        </w:rPr>
         <w:t>3.1 Session State (Per-Request)</w:t>
       </w:r>
+    </w:p>
+    <w:p>
+      <w:pPr>
+        <w:rPr>
+          <w:b/>
+        </w:rPr>
+      </w:pPr>
     </w:p>
     <w:p>
       <w:pPr>
         <w:pStyle w:val="ListParagraph"/>
         <w:numPr>
           <w:ilvl w:val="0"/>
-          <w:numId w:val="3"/>
+          <w:numId w:val="11"/>
         </w:numPr>
       </w:pPr>
-      <w:proofErr w:type="spellStart"/>
-      <w:r>
-        <w:rPr>
-          <w:rFonts w:ascii="Courier New" w:eastAsia="Courier New" w:hAnsi="Courier New" w:cs="Courier New"/>
-          <w:sz w:val="22"/>
-          <w:szCs w:val="22"/>
+      <w:r>
+        <w:rPr>
+          <w:rFonts w:eastAsia="Courier New"/>
         </w:rPr>
         <w:t>customer_message</w:t>
       </w:r>
-      <w:proofErr w:type="spellEnd"/>
       <w:r>
         <w:t>: Original customer input (untrusted).</w:t>
       </w:r>
@@ -1614,19 +1442,15 @@
         <w:pStyle w:val="ListParagraph"/>
         <w:numPr>
           <w:ilvl w:val="0"/>
-          <w:numId w:val="3"/>
+          <w:numId w:val="11"/>
         </w:numPr>
       </w:pPr>
-      <w:proofErr w:type="spellStart"/>
-      <w:r>
-        <w:rPr>
-          <w:rFonts w:ascii="Courier New" w:eastAsia="Courier New" w:hAnsi="Courier New" w:cs="Courier New"/>
-          <w:sz w:val="22"/>
-          <w:szCs w:val="22"/>
+      <w:r>
+        <w:rPr>
+          <w:rFonts w:eastAsia="Courier New"/>
         </w:rPr>
         <w:t>classification_result</w:t>
       </w:r>
-      <w:proofErr w:type="spellEnd"/>
       <w:r>
         <w:t>: Category and confidence from the model.</w:t>
       </w:r>
@@ -1636,29 +1460,17 @@
         <w:pStyle w:val="ListParagraph"/>
         <w:numPr>
           <w:ilvl w:val="0"/>
-          <w:numId w:val="3"/>
+          <w:numId w:val="11"/>
         </w:numPr>
       </w:pPr>
-      <w:proofErr w:type="spellStart"/>
-      <w:r>
-        <w:rPr>
-          <w:rFonts w:ascii="Courier New" w:eastAsia="Courier New" w:hAnsi="Courier New" w:cs="Courier New"/>
-          <w:sz w:val="22"/>
-          <w:szCs w:val="22"/>
+      <w:r>
+        <w:rPr>
+          <w:rFonts w:eastAsia="Courier New"/>
         </w:rPr>
         <w:t>grounding_status</w:t>
       </w:r>
-      <w:proofErr w:type="spellEnd"/>
-      <w:r>
-        <w:t xml:space="preserve">: Whether sufficient evidence was found (grounded / </w:t>
-      </w:r>
-      <w:proofErr w:type="spellStart"/>
-      <w:r>
-        <w:t>insufficient_evidence</w:t>
-      </w:r>
-      <w:proofErr w:type="spellEnd"/>
-      <w:r>
-        <w:t>).</w:t>
+      <w:r>
+        <w:t>: Whether sufficient evidence was found (grounded / insufficient_evidence).</w:t>
       </w:r>
     </w:p>
     <w:p>
@@ -1666,24 +1478,17 @@
         <w:pStyle w:val="ListParagraph"/>
         <w:numPr>
           <w:ilvl w:val="0"/>
-          <w:numId w:val="3"/>
+          <w:numId w:val="11"/>
         </w:numPr>
       </w:pPr>
-      <w:proofErr w:type="spellStart"/>
-      <w:r>
-        <w:rPr>
-          <w:rFonts w:ascii="Courier New" w:eastAsia="Courier New" w:hAnsi="Courier New" w:cs="Courier New"/>
-          <w:sz w:val="22"/>
-          <w:szCs w:val="22"/>
+      <w:r>
+        <w:rPr>
+          <w:rFonts w:eastAsia="Courier New"/>
         </w:rPr>
         <w:t>retrieved_sources</w:t>
       </w:r>
-      <w:proofErr w:type="spellEnd"/>
-      <w:r>
-        <w:t>: List of knowledge base documents used for g</w:t>
-      </w:r>
-      <w:r>
-        <w:t>rounding.</w:t>
+      <w:r>
+        <w:t>: List of knowledge base documents used for grounding.</w:t>
       </w:r>
     </w:p>
     <w:p>
@@ -1691,19 +1496,15 @@
         <w:pStyle w:val="ListParagraph"/>
         <w:numPr>
           <w:ilvl w:val="0"/>
-          <w:numId w:val="3"/>
+          <w:numId w:val="11"/>
         </w:numPr>
       </w:pPr>
-      <w:proofErr w:type="spellStart"/>
-      <w:r>
-        <w:rPr>
-          <w:rFonts w:ascii="Courier New" w:eastAsia="Courier New" w:hAnsi="Courier New" w:cs="Courier New"/>
-          <w:sz w:val="22"/>
-          <w:szCs w:val="22"/>
+      <w:r>
+        <w:rPr>
+          <w:rFonts w:eastAsia="Courier New"/>
         </w:rPr>
         <w:t>tool_calls_made</w:t>
       </w:r>
-      <w:proofErr w:type="spellEnd"/>
       <w:r>
         <w:t>: List of tools called with their arguments.</w:t>
       </w:r>
@@ -1713,19 +1514,15 @@
         <w:pStyle w:val="ListParagraph"/>
         <w:numPr>
           <w:ilvl w:val="0"/>
-          <w:numId w:val="3"/>
+          <w:numId w:val="11"/>
         </w:numPr>
       </w:pPr>
-      <w:proofErr w:type="spellStart"/>
-      <w:r>
-        <w:rPr>
-          <w:rFonts w:ascii="Courier New" w:eastAsia="Courier New" w:hAnsi="Courier New" w:cs="Courier New"/>
-          <w:sz w:val="22"/>
-          <w:szCs w:val="22"/>
+      <w:r>
+        <w:rPr>
+          <w:rFonts w:eastAsia="Courier New"/>
         </w:rPr>
         <w:t>tool_results</w:t>
       </w:r>
-      <w:proofErr w:type="spellEnd"/>
       <w:r>
         <w:t>: Results from executed tool calls.</w:t>
       </w:r>
@@ -1735,19 +1532,15 @@
         <w:pStyle w:val="ListParagraph"/>
         <w:numPr>
           <w:ilvl w:val="0"/>
-          <w:numId w:val="3"/>
+          <w:numId w:val="11"/>
         </w:numPr>
       </w:pPr>
-      <w:proofErr w:type="spellStart"/>
-      <w:r>
-        <w:rPr>
-          <w:rFonts w:ascii="Courier New" w:eastAsia="Courier New" w:hAnsi="Courier New" w:cs="Courier New"/>
-          <w:sz w:val="22"/>
-          <w:szCs w:val="22"/>
+      <w:r>
+        <w:rPr>
+          <w:rFonts w:eastAsia="Courier New"/>
         </w:rPr>
         <w:t>iteration_count</w:t>
       </w:r>
-      <w:proofErr w:type="spellEnd"/>
       <w:r>
         <w:t>: Number of plan-act-observe cycles completed.</w:t>
       </w:r>
@@ -1757,24 +1550,17 @@
         <w:pStyle w:val="ListParagraph"/>
         <w:numPr>
           <w:ilvl w:val="0"/>
-          <w:numId w:val="3"/>
+          <w:numId w:val="11"/>
         </w:numPr>
       </w:pPr>
-      <w:proofErr w:type="spellStart"/>
-      <w:r>
-        <w:rPr>
-          <w:rFonts w:ascii="Courier New" w:eastAsia="Courier New" w:hAnsi="Courier New" w:cs="Courier New"/>
-          <w:sz w:val="22"/>
-          <w:szCs w:val="22"/>
+      <w:r>
+        <w:rPr>
+          <w:rFonts w:eastAsia="Courier New"/>
         </w:rPr>
         <w:t>requires_clarification</w:t>
       </w:r>
-      <w:proofErr w:type="spellEnd"/>
-      <w:r>
-        <w:t>: Boolean flag indicating if more information is neede</w:t>
-      </w:r>
-      <w:r>
-        <w:t>d.</w:t>
+      <w:r>
+        <w:t>: Boolean flag indicating if more information is needed.</w:t>
       </w:r>
     </w:p>
     <w:p>
@@ -1782,206 +1568,138 @@
         <w:pStyle w:val="ListParagraph"/>
         <w:numPr>
           <w:ilvl w:val="0"/>
-          <w:numId w:val="3"/>
+          <w:numId w:val="11"/>
         </w:numPr>
       </w:pPr>
-      <w:proofErr w:type="spellStart"/>
-      <w:r>
-        <w:rPr>
-          <w:rFonts w:ascii="Courier New" w:eastAsia="Courier New" w:hAnsi="Courier New" w:cs="Courier New"/>
-          <w:sz w:val="22"/>
-          <w:szCs w:val="22"/>
+      <w:r>
+        <w:rPr>
+          <w:rFonts w:eastAsia="Courier New"/>
         </w:rPr>
         <w:t>clarifying_question</w:t>
       </w:r>
-      <w:proofErr w:type="spellEnd"/>
       <w:r>
         <w:t>: Question to ask the customer if clarification is needed.</w:t>
       </w:r>
     </w:p>
-    <w:p>
-      <w:pPr>
-        <w:pStyle w:val="Heading2"/>
-        <w:keepNext/>
-        <w:spacing w:before="180" w:after="80"/>
-      </w:pPr>
-      <w:r>
+    <w:p/>
+    <w:p>
+      <w:pPr>
+        <w:rPr>
+          <w:b/>
+        </w:rPr>
+      </w:pPr>
+      <w:r>
+        <w:rPr>
+          <w:b/>
+        </w:rPr>
         <w:t>3.2 State Persistence</w:t>
       </w:r>
     </w:p>
-    <w:p>
-      <w:pPr>
-        <w:pStyle w:val="ListParagraph"/>
-        <w:numPr>
-          <w:ilvl w:val="0"/>
-          <w:numId w:val="3"/>
-        </w:numPr>
-      </w:pPr>
-      <w:r>
+    <w:p/>
+    <w:p>
+      <w:r>
+        <w:lastRenderedPageBreak/>
         <w:t>No persistent memory is implemented yet (Week 6 deliverable).</w:t>
       </w:r>
     </w:p>
     <w:p>
-      <w:pPr>
-        <w:pStyle w:val="ListParagraph"/>
-        <w:numPr>
-          <w:ilvl w:val="0"/>
-          <w:numId w:val="3"/>
-        </w:numPr>
-      </w:pPr>
       <w:r>
         <w:t>All state is session-scoped and discarded after the request is complete.</w:t>
       </w:r>
     </w:p>
-    <w:p>
-      <w:pPr>
-        <w:pStyle w:val="Heading2"/>
-        <w:keepNext/>
-        <w:spacing w:before="180" w:after="80"/>
-      </w:pPr>
-      <w:r>
-        <w:t>3.3 State Invarian</w:t>
-      </w:r>
-      <w:r>
-        <w:t>ts</w:t>
-      </w:r>
-    </w:p>
-    <w:p>
-      <w:pPr>
-        <w:pStyle w:val="ListParagraph"/>
-        <w:numPr>
-          <w:ilvl w:val="0"/>
-          <w:numId w:val="3"/>
-        </w:numPr>
-      </w:pPr>
-      <w:proofErr w:type="spellStart"/>
-      <w:r>
-        <w:rPr>
-          <w:rFonts w:ascii="Courier New" w:eastAsia="Courier New" w:hAnsi="Courier New" w:cs="Courier New"/>
-          <w:sz w:val="22"/>
-          <w:szCs w:val="22"/>
+    <w:p/>
+    <w:p>
+      <w:pPr>
+        <w:rPr>
+          <w:b/>
+        </w:rPr>
+      </w:pPr>
+      <w:r>
+        <w:rPr>
+          <w:b/>
+        </w:rPr>
+        <w:t>3.3 State Invariants</w:t>
+      </w:r>
+    </w:p>
+    <w:p>
+      <w:pPr>
+        <w:rPr>
+          <w:b/>
+        </w:rPr>
+      </w:pPr>
+    </w:p>
+    <w:p>
+      <w:r>
+        <w:rPr>
+          <w:rFonts w:eastAsia="Courier New"/>
         </w:rPr>
         <w:t>iteration_count</w:t>
       </w:r>
-      <w:proofErr w:type="spellEnd"/>
       <w:r>
         <w:t xml:space="preserve"> must not exceed </w:t>
       </w:r>
       <w:r>
         <w:rPr>
-          <w:rFonts w:ascii="Courier New" w:eastAsia="Courier New" w:hAnsi="Courier New" w:cs="Courier New"/>
-          <w:sz w:val="22"/>
-          <w:szCs w:val="22"/>
+          <w:rFonts w:eastAsia="Courier New"/>
         </w:rPr>
         <w:t>MAX_ITERATIONS</w:t>
       </w:r>
       <w:r>
         <w:t xml:space="preserve">; the workflow must stop when </w:t>
       </w:r>
-      <w:proofErr w:type="spellStart"/>
-      <w:r>
-        <w:rPr>
-          <w:rFonts w:ascii="Courier New" w:eastAsia="Courier New" w:hAnsi="Courier New" w:cs="Courier New"/>
-          <w:sz w:val="22"/>
-          <w:szCs w:val="22"/>
-        </w:rPr>
-        <w:t>iteration_count</w:t>
-      </w:r>
-      <w:proofErr w:type="spellEnd"/>
-      <w:r>
-        <w:rPr>
-          <w:rFonts w:ascii="Courier New" w:eastAsia="Courier New" w:hAnsi="Courier New" w:cs="Courier New"/>
-          <w:sz w:val="22"/>
-          <w:szCs w:val="22"/>
-        </w:rPr>
-        <w:t xml:space="preserve"> &gt;= MAX_ITERATIONS</w:t>
+      <w:r>
+        <w:rPr>
+          <w:rFonts w:eastAsia="Courier New"/>
+        </w:rPr>
+        <w:t>iteration_count &gt;= MAX_ITERATIONS</w:t>
       </w:r>
       <w:r>
         <w:t>.</w:t>
       </w:r>
     </w:p>
     <w:p>
-      <w:pPr>
-        <w:pStyle w:val="ListParagraph"/>
-        <w:numPr>
-          <w:ilvl w:val="0"/>
-          <w:numId w:val="3"/>
-        </w:numPr>
-      </w:pPr>
       <w:r>
         <w:t xml:space="preserve">If </w:t>
       </w:r>
-      <w:proofErr w:type="spellStart"/>
-      <w:r>
-        <w:rPr>
-          <w:rFonts w:ascii="Courier New" w:eastAsia="Courier New" w:hAnsi="Courier New" w:cs="Courier New"/>
-          <w:sz w:val="22"/>
-          <w:szCs w:val="22"/>
+      <w:r>
+        <w:rPr>
+          <w:rFonts w:eastAsia="Courier New"/>
         </w:rPr>
         <w:t>requires_clarification</w:t>
       </w:r>
-      <w:proofErr w:type="spellEnd"/>
       <w:r>
         <w:t xml:space="preserve"> is true, the workflow must stop and request clarification.</w:t>
       </w:r>
     </w:p>
     <w:p>
-      <w:pPr>
-        <w:pStyle w:val="ListParagraph"/>
-        <w:numPr>
-          <w:ilvl w:val="0"/>
-          <w:numId w:val="3"/>
-        </w:numPr>
-      </w:pPr>
       <w:r>
         <w:t xml:space="preserve">If </w:t>
       </w:r>
-      <w:proofErr w:type="spellStart"/>
-      <w:r>
-        <w:rPr>
-          <w:rFonts w:ascii="Courier New" w:eastAsia="Courier New" w:hAnsi="Courier New" w:cs="Courier New"/>
-          <w:sz w:val="22"/>
-          <w:szCs w:val="22"/>
+      <w:r>
+        <w:rPr>
+          <w:rFonts w:eastAsia="Courier New"/>
         </w:rPr>
         <w:t>grounding_status</w:t>
       </w:r>
-      <w:proofErr w:type="spellEnd"/>
       <w:r>
         <w:t xml:space="preserve"> is </w:t>
       </w:r>
-      <w:proofErr w:type="spellStart"/>
-      <w:r>
-        <w:rPr>
-          <w:rFonts w:ascii="Courier New" w:eastAsia="Courier New" w:hAnsi="Courier New" w:cs="Courier New"/>
-          <w:sz w:val="22"/>
-          <w:szCs w:val="22"/>
+      <w:r>
+        <w:rPr>
+          <w:rFonts w:eastAsia="Courier New"/>
         </w:rPr>
         <w:t>insufficient_evidence</w:t>
       </w:r>
-      <w:proofErr w:type="spellEnd"/>
-      <w:r>
-        <w:t>, the agent m</w:t>
-      </w:r>
-      <w:r>
-        <w:t>ust not invent facts.</w:t>
-      </w:r>
-    </w:p>
-    <w:p>
-      <w:pPr>
-        <w:pStyle w:val="ListParagraph"/>
-        <w:numPr>
-          <w:ilvl w:val="0"/>
-          <w:numId w:val="3"/>
-        </w:numPr>
-      </w:pPr>
+      <w:r>
+        <w:t>, the agent must not invent facts.</w:t>
+      </w:r>
+    </w:p>
+    <w:p>
       <w:r>
         <w:t>Tool results must be validated against documented output schemas.</w:t>
       </w:r>
     </w:p>
     <w:p>
-      <w:pPr>
-        <w:spacing w:after="100"/>
-      </w:pPr>
       <w:r>
         <w:rPr>
           <w:b/>
@@ -1990,26 +1708,31 @@
         <w:t>Design rationale:</w:t>
       </w:r>
       <w:r>
-        <w:t xml:space="preserve"> These state variables allow the orchestrator to retain the information required to make the next decision without treating the entire interaction as an unrestricted autonomous process. Each state variable has a specific purpose in the bounded workflow and</w:t>
-      </w:r>
-      <w:r>
-        <w:t xml:space="preserve"> is cleared after the request is complete.</w:t>
-      </w:r>
-    </w:p>
-    <w:p>
-      <w:pPr>
-        <w:pStyle w:val="Heading1"/>
-        <w:keepNext/>
-        <w:spacing w:before="240" w:after="120"/>
-      </w:pPr>
-      <w:r>
+        <w:t xml:space="preserve"> These state variables allow the orchestrator to retain the information required to make the next decision without treating the entire interaction as an unrestricted autonomous process. Each state variable has a specific purpose in the bounded workflow and is cleared after the request is complete.</w:t>
+      </w:r>
+    </w:p>
+    <w:p/>
+    <w:p>
+      <w:pPr>
+        <w:rPr>
+          <w:b/>
+        </w:rPr>
+      </w:pPr>
+      <w:r>
+        <w:rPr>
+          <w:b/>
+        </w:rPr>
         <w:t>4. Maximum Iterations</w:t>
       </w:r>
     </w:p>
     <w:p>
       <w:pPr>
-        <w:spacing w:after="100"/>
-      </w:pPr>
+        <w:rPr>
+          <w:b/>
+        </w:rPr>
+      </w:pPr>
+    </w:p>
+    <w:p>
       <w:r>
         <w:rPr>
           <w:b/>
@@ -2020,108 +1743,94 @@
     </w:p>
     <w:p>
       <w:pPr>
-        <w:keepNext/>
-        <w:spacing w:after="100"/>
-      </w:pPr>
-      <w:r>
         <w:rPr>
           <w:b/>
           <w:bCs/>
         </w:rPr>
+      </w:pPr>
+    </w:p>
+    <w:p>
+      <w:r>
+        <w:rPr>
+          <w:b/>
+          <w:bCs/>
+        </w:rPr>
         <w:t>Rationale:</w:t>
       </w:r>
     </w:p>
     <w:p>
-      <w:pPr>
-        <w:pStyle w:val="ListParagraph"/>
-        <w:numPr>
-          <w:ilvl w:val="0"/>
-          <w:numId w:val="3"/>
-        </w:numPr>
-      </w:pPr>
       <w:r>
         <w:t>Most triage requests can be completed in 1–2 iterations (classify → optionally check outage → optionally draft ticket).</w:t>
       </w:r>
     </w:p>
     <w:p>
-      <w:pPr>
-        <w:pStyle w:val="ListParagraph"/>
-        <w:numPr>
-          <w:ilvl w:val="0"/>
-          <w:numId w:val="3"/>
-        </w:numPr>
-      </w:pPr>
       <w:r>
         <w:t xml:space="preserve">3 iterations </w:t>
       </w:r>
-      <w:proofErr w:type="gramStart"/>
-      <w:r>
-        <w:t>provides</w:t>
-      </w:r>
-      <w:proofErr w:type="gramEnd"/>
-      <w:r>
-        <w:t xml:space="preserve"> buffer for multi-st</w:t>
-      </w:r>
-      <w:r>
-        <w:t>ep workflows (e.g., outage check → guidance → ticket).</w:t>
-      </w:r>
-    </w:p>
-    <w:p>
-      <w:pPr>
-        <w:pStyle w:val="ListParagraph"/>
-        <w:numPr>
-          <w:ilvl w:val="0"/>
-          <w:numId w:val="3"/>
-        </w:numPr>
-      </w:pPr>
+      <w:r>
+        <w:t>provide</w:t>
+      </w:r>
+      <w:r>
+        <w:t xml:space="preserve"> buffer for multi-step workflows (e.g., outage check → guidance → ticket).</w:t>
+      </w:r>
+    </w:p>
+    <w:p>
       <w:r>
         <w:t>Higher limits increase the risk of loops and hallucination; lower limits prevent legitimate multi-step workflows.</w:t>
       </w:r>
     </w:p>
     <w:p>
-      <w:pPr>
-        <w:spacing w:after="100"/>
-      </w:pPr>
       <w:r>
         <w:t>The iteration counter increments only on Plan-Act-Observe cycles, not on the Sense phase.</w:t>
       </w:r>
     </w:p>
-    <w:p>
-      <w:pPr>
-        <w:pStyle w:val="Heading1"/>
-        <w:keepNext/>
-        <w:spacing w:before="240" w:after="120"/>
-      </w:pPr>
-      <w:r>
+    <w:p/>
+    <w:p>
+      <w:pPr>
+        <w:rPr>
+          <w:b/>
+        </w:rPr>
+      </w:pPr>
+      <w:r>
+        <w:rPr>
+          <w:b/>
+        </w:rPr>
         <w:t>5. Exact Stop Conditions</w:t>
       </w:r>
     </w:p>
     <w:p>
       <w:pPr>
-        <w:spacing w:after="100"/>
-      </w:pPr>
+        <w:rPr>
+          <w:b/>
+        </w:rPr>
+      </w:pPr>
+    </w:p>
+    <w:p>
       <w:r>
         <w:t>The agent workflow MUST stop immediately when ANY of the following conditions is met.</w:t>
       </w:r>
     </w:p>
     <w:p>
       <w:pPr>
-        <w:pStyle w:val="Heading2"/>
-        <w:keepNext/>
-        <w:spacing w:before="180" w:after="80"/>
-      </w:pPr>
-      <w:r>
+        <w:rPr>
+          <w:b/>
+        </w:rPr>
+      </w:pPr>
+    </w:p>
+    <w:p>
+      <w:pPr>
+        <w:rPr>
+          <w:b/>
+        </w:rPr>
+      </w:pPr>
+      <w:r>
+        <w:rPr>
+          <w:b/>
+        </w:rPr>
         <w:t>5.1 Success Stop Conditions</w:t>
       </w:r>
     </w:p>
     <w:p>
-      <w:pPr>
-        <w:pStyle w:val="ListParagraph"/>
-        <w:numPr>
-          <w:ilvl w:val="0"/>
-          <w:numId w:val="4"/>
-        </w:numPr>
-      </w:pPr>
       <w:r>
         <w:rPr>
           <w:b/>
@@ -2130,44 +1839,20 @@
         <w:t>Goal achieved:</w:t>
       </w:r>
       <w:r>
-        <w:t xml:space="preserve"> Classificati</w:t>
-      </w:r>
-      <w:r>
-        <w:t>on complete, grounded guidance provided, and (if applicable):</w:t>
-      </w:r>
-    </w:p>
-    <w:p>
-      <w:pPr>
-        <w:pStyle w:val="ListParagraph"/>
-        <w:numPr>
-          <w:ilvl w:val="1"/>
-          <w:numId w:val="3"/>
-        </w:numPr>
-      </w:pPr>
+        <w:t xml:space="preserve"> Classification complete, grounded guidance provided, and (if applicable):</w:t>
+      </w:r>
+    </w:p>
+    <w:p>
       <w:r>
         <w:t>Outage status checked for outage-related issues.</w:t>
       </w:r>
     </w:p>
     <w:p>
-      <w:pPr>
-        <w:pStyle w:val="ListParagraph"/>
-        <w:numPr>
-          <w:ilvl w:val="1"/>
-          <w:numId w:val="3"/>
-        </w:numPr>
-      </w:pPr>
       <w:r>
         <w:t>Ticket drafted for issues requiring human follow-up.</w:t>
       </w:r>
     </w:p>
     <w:p>
-      <w:pPr>
-        <w:pStyle w:val="ListParagraph"/>
-        <w:numPr>
-          <w:ilvl w:val="0"/>
-          <w:numId w:val="4"/>
-        </w:numPr>
-      </w:pPr>
       <w:r>
         <w:rPr>
           <w:b/>
@@ -2178,41 +1863,31 @@
       <w:r>
         <w:t xml:space="preserve"> </w:t>
       </w:r>
-      <w:proofErr w:type="spellStart"/>
-      <w:r>
-        <w:rPr>
-          <w:rFonts w:ascii="Courier New" w:eastAsia="Courier New" w:hAnsi="Courier New" w:cs="Courier New"/>
-          <w:sz w:val="22"/>
-          <w:szCs w:val="22"/>
+      <w:r>
+        <w:rPr>
+          <w:rFonts w:eastAsia="Courier New"/>
         </w:rPr>
         <w:t>requires_clarification</w:t>
       </w:r>
-      <w:proofErr w:type="spellEnd"/>
-      <w:r>
-        <w:t xml:space="preserve"> is true → stop and return the clarifying questi</w:t>
-      </w:r>
-      <w:r>
-        <w:t>on to the customer.</w:t>
-      </w:r>
-    </w:p>
-    <w:p>
-      <w:pPr>
-        <w:pStyle w:val="Heading2"/>
-        <w:keepNext/>
-        <w:spacing w:before="180" w:after="80"/>
-      </w:pPr>
-      <w:r>
+      <w:r>
+        <w:t xml:space="preserve"> is true → stop and return the clarifying question to the customer.</w:t>
+      </w:r>
+    </w:p>
+    <w:p/>
+    <w:p>
+      <w:pPr>
+        <w:rPr>
+          <w:b/>
+        </w:rPr>
+      </w:pPr>
+      <w:r>
+        <w:rPr>
+          <w:b/>
+        </w:rPr>
         <w:t>5.2 Failure Stop Conditions</w:t>
       </w:r>
     </w:p>
     <w:p>
-      <w:pPr>
-        <w:pStyle w:val="ListParagraph"/>
-        <w:numPr>
-          <w:ilvl w:val="0"/>
-          <w:numId w:val="4"/>
-        </w:numPr>
-      </w:pPr>
       <w:r>
         <w:rPr>
           <w:b/>
@@ -2223,36 +1898,17 @@
       <w:r>
         <w:t xml:space="preserve"> </w:t>
       </w:r>
-      <w:proofErr w:type="spellStart"/>
-      <w:r>
-        <w:rPr>
-          <w:rFonts w:ascii="Courier New" w:eastAsia="Courier New" w:hAnsi="Courier New" w:cs="Courier New"/>
-          <w:sz w:val="22"/>
-          <w:szCs w:val="22"/>
-        </w:rPr>
-        <w:t>iteration_count</w:t>
-      </w:r>
-      <w:proofErr w:type="spellEnd"/>
-      <w:r>
-        <w:rPr>
-          <w:rFonts w:ascii="Courier New" w:eastAsia="Courier New" w:hAnsi="Courier New" w:cs="Courier New"/>
-          <w:sz w:val="22"/>
-          <w:szCs w:val="22"/>
-        </w:rPr>
-        <w:t xml:space="preserve"> &gt;= MAX_ITERATIONS</w:t>
+      <w:r>
+        <w:rPr>
+          <w:rFonts w:eastAsia="Courier New"/>
+        </w:rPr>
+        <w:t>iteration_count &gt;= MAX_ITERATIONS</w:t>
       </w:r>
       <w:r>
         <w:t xml:space="preserve"> → stop execution.</w:t>
       </w:r>
     </w:p>
     <w:p>
-      <w:pPr>
-        <w:pStyle w:val="ListParagraph"/>
-        <w:numPr>
-          <w:ilvl w:val="0"/>
-          <w:numId w:val="4"/>
-        </w:numPr>
-      </w:pPr>
       <w:r>
         <w:rPr>
           <w:b/>
@@ -2265,13 +1921,6 @@
       </w:r>
     </w:p>
     <w:p>
-      <w:pPr>
-        <w:pStyle w:val="ListParagraph"/>
-        <w:numPr>
-          <w:ilvl w:val="0"/>
-          <w:numId w:val="4"/>
-        </w:numPr>
-      </w:pPr>
       <w:r>
         <w:rPr>
           <w:b/>
@@ -2280,20 +1929,10 @@
         <w:t>Model parsing failure:</w:t>
       </w:r>
       <w:r>
-        <w:t xml:space="preserve"> Model response ca</w:t>
-      </w:r>
-      <w:r>
-        <w:t>nnot be parsed as valid JSON.</w:t>
-      </w:r>
-    </w:p>
-    <w:p>
-      <w:pPr>
-        <w:pStyle w:val="ListParagraph"/>
-        <w:numPr>
-          <w:ilvl w:val="0"/>
-          <w:numId w:val="4"/>
-        </w:numPr>
-      </w:pPr>
+        <w:t xml:space="preserve"> Model response cannot be parsed as valid JSON.</w:t>
+      </w:r>
+    </w:p>
+    <w:p>
       <w:r>
         <w:rPr>
           <w:b/>
@@ -2306,19 +1945,26 @@
       </w:r>
     </w:p>
     <w:p>
-      <w:pPr>
-        <w:pStyle w:val="ListParagraph"/>
-        <w:numPr>
-          <w:ilvl w:val="0"/>
-          <w:numId w:val="4"/>
-        </w:numPr>
-      </w:pPr>
       <w:r>
         <w:rPr>
           <w:b/>
           <w:bCs/>
         </w:rPr>
-        <w:t>Unauthorized tool call:</w:t>
+        <w:t xml:space="preserve">Unauthorized tool </w:t>
+      </w:r>
+      <w:r>
+        <w:rPr>
+          <w:b/>
+          <w:bCs/>
+        </w:rPr>
+        <w:t>calls</w:t>
+      </w:r>
+      <w:r>
+        <w:rPr>
+          <w:b/>
+          <w:bCs/>
+        </w:rPr>
+        <w:t>:</w:t>
       </w:r>
       <w:r>
         <w:t xml:space="preserve"> Attempt to call an unregistered tool.</w:t>
@@ -2326,44 +1972,31 @@
     </w:p>
     <w:p>
       <w:pPr>
-        <w:pStyle w:val="Heading2"/>
-        <w:keepNext/>
-        <w:spacing w:before="180" w:after="80"/>
-      </w:pPr>
-      <w:r>
+        <w:rPr>
+          <w:b/>
+        </w:rPr>
+      </w:pPr>
+      <w:r>
+        <w:rPr>
+          <w:b/>
+        </w:rPr>
         <w:t>5.3 Safety Stop Conditions</w:t>
       </w:r>
     </w:p>
     <w:p>
-      <w:pPr>
-        <w:pStyle w:val="ListParagraph"/>
-        <w:numPr>
-          <w:ilvl w:val="0"/>
-          <w:numId w:val="4"/>
-        </w:numPr>
-      </w:pPr>
       <w:r>
         <w:rPr>
           <w:b/>
           <w:bCs/>
         </w:rPr>
+        <w:lastRenderedPageBreak/>
         <w:t>High-impact action attempted:</w:t>
       </w:r>
       <w:r>
-        <w:t xml:space="preserve"> Agent attempts to control</w:t>
-      </w:r>
-      <w:r>
-        <w:t xml:space="preserve"> infrastructure, change billing, or make financial commitments.</w:t>
-      </w:r>
-    </w:p>
-    <w:p>
-      <w:pPr>
-        <w:pStyle w:val="ListParagraph"/>
-        <w:numPr>
-          <w:ilvl w:val="0"/>
-          <w:numId w:val="4"/>
-        </w:numPr>
-      </w:pPr>
+        <w:t xml:space="preserve"> Agent attempts to control infrastructure, change billing, or make financial commitments.</w:t>
+      </w:r>
+    </w:p>
+    <w:p>
       <w:r>
         <w:rPr>
           <w:b/>
@@ -2376,13 +2009,6 @@
       </w:r>
     </w:p>
     <w:p>
-      <w:pPr>
-        <w:pStyle w:val="ListParagraph"/>
-        <w:numPr>
-          <w:ilvl w:val="0"/>
-          <w:numId w:val="4"/>
-        </w:numPr>
-      </w:pPr>
       <w:r>
         <w:rPr>
           <w:b/>
@@ -2391,30 +2017,24 @@
         <w:t>Sensitive data request:</w:t>
       </w:r>
       <w:r>
-        <w:t xml:space="preserve"> Agent attempts to request sensitive data from the custome</w:t>
-      </w:r>
-      <w:r>
-        <w:t>r.</w:t>
-      </w:r>
-    </w:p>
-    <w:p>
-      <w:pPr>
-        <w:pStyle w:val="Heading2"/>
-        <w:keepNext/>
-        <w:spacing w:before="180" w:after="80"/>
-      </w:pPr>
-      <w:r>
+        <w:t xml:space="preserve"> Agent attempts to request sensitive data from the customer.</w:t>
+      </w:r>
+    </w:p>
+    <w:p/>
+    <w:p>
+      <w:pPr>
+        <w:rPr>
+          <w:b/>
+        </w:rPr>
+      </w:pPr>
+      <w:r>
+        <w:rPr>
+          <w:b/>
+        </w:rPr>
         <w:t>5.4 Human Hand-Off Conditions</w:t>
       </w:r>
     </w:p>
     <w:p>
-      <w:pPr>
-        <w:pStyle w:val="ListParagraph"/>
-        <w:numPr>
-          <w:ilvl w:val="0"/>
-          <w:numId w:val="4"/>
-        </w:numPr>
-      </w:pPr>
       <w:r>
         <w:rPr>
           <w:b/>
@@ -2425,28 +2045,23 @@
       <w:r>
         <w:t xml:space="preserve"> After </w:t>
       </w:r>
-      <w:proofErr w:type="spellStart"/>
-      <w:r>
-        <w:rPr>
-          <w:rFonts w:ascii="Courier New" w:eastAsia="Courier New" w:hAnsi="Courier New" w:cs="Courier New"/>
-          <w:sz w:val="22"/>
-          <w:szCs w:val="22"/>
+      <w:r>
+        <w:rPr>
+          <w:rFonts w:eastAsia="Courier New"/>
         </w:rPr>
         <w:t>draft_ticket</w:t>
       </w:r>
-      <w:proofErr w:type="spellEnd"/>
-      <w:r>
-        <w:t xml:space="preserve"> is called, the workflow stops (the draft requires human approval).</w:t>
-      </w:r>
-    </w:p>
-    <w:p>
-      <w:pPr>
-        <w:pStyle w:val="ListParagraph"/>
-        <w:numPr>
-          <w:ilvl w:val="0"/>
-          <w:numId w:val="4"/>
-        </w:numPr>
-      </w:pPr>
+      <w:r>
+        <w:t xml:space="preserve"> is </w:t>
+      </w:r>
+      <w:r>
+        <w:t>called;</w:t>
+      </w:r>
+      <w:r>
+        <w:t xml:space="preserve"> the workflow stops (the draft requires human approval).</w:t>
+      </w:r>
+    </w:p>
+    <w:p>
       <w:r>
         <w:rPr>
           <w:b/>
@@ -2459,13 +2074,6 @@
       </w:r>
     </w:p>
     <w:p>
-      <w:pPr>
-        <w:pStyle w:val="ListParagraph"/>
-        <w:numPr>
-          <w:ilvl w:val="0"/>
-          <w:numId w:val="4"/>
-        </w:numPr>
-      </w:pPr>
       <w:r>
         <w:rPr>
           <w:b/>
@@ -2477,16 +2085,21 @@
         <w:t xml:space="preserve"> Customer message indicates an emergency (e.g., fire, medical emergency) → immediate hand-off.</w:t>
       </w:r>
     </w:p>
-    <w:p>
-      <w:pPr>
-        <w:pStyle w:val="Heading2"/>
-        <w:keepNext/>
-        <w:spacing w:before="180" w:after="80"/>
-      </w:pPr>
-      <w:r>
+    <w:p/>
+    <w:p>
+      <w:pPr>
+        <w:rPr>
+          <w:b/>
+        </w:rPr>
+      </w:pPr>
+      <w:r>
+        <w:rPr>
+          <w:b/>
+        </w:rPr>
         <w:t>5.5 Stop/Continue Decision Table</w:t>
       </w:r>
     </w:p>
+    <w:p/>
     <w:tbl>
       <w:tblPr>
         <w:tblW w:w="9360" w:type="dxa"/>
@@ -2509,12 +2122,6 @@
         <w:gridCol w:w="5160"/>
       </w:tblGrid>
       <w:tr>
-        <w:tblPrEx>
-          <w:tblCellMar>
-            <w:top w:w="0" w:type="dxa"/>
-            <w:bottom w:w="0" w:type="dxa"/>
-          </w:tblCellMar>
-        </w:tblPrEx>
         <w:trPr>
           <w:cantSplit/>
           <w:tblHeader/>
@@ -2528,7 +2135,7 @@
               <w:bottom w:val="single" w:sz="4" w:space="0" w:color="000000"/>
               <w:right w:val="single" w:sz="4" w:space="0" w:color="000000"/>
             </w:tcBorders>
-            <w:shd w:val="clear" w:color="auto" w:fill="D9D9D9"/>
+            <w:shd w:val="clear" w:color="auto" w:fill="FFFFFF" w:themeFill="background1"/>
             <w:tcMar>
               <w:top w:w="60" w:type="dxa"/>
               <w:left w:w="100" w:type="dxa"/>
@@ -2541,8 +2148,6 @@
               <w:rPr>
                 <w:b/>
                 <w:bCs/>
-                <w:sz w:val="22"/>
-                <w:szCs w:val="22"/>
               </w:rPr>
               <w:t>Condition</w:t>
             </w:r>
@@ -2557,7 +2162,7 @@
               <w:bottom w:val="single" w:sz="4" w:space="0" w:color="000000"/>
               <w:right w:val="single" w:sz="4" w:space="0" w:color="000000"/>
             </w:tcBorders>
-            <w:shd w:val="clear" w:color="auto" w:fill="D9D9D9"/>
+            <w:shd w:val="clear" w:color="auto" w:fill="FFFFFF" w:themeFill="background1"/>
             <w:tcMar>
               <w:top w:w="60" w:type="dxa"/>
               <w:left w:w="100" w:type="dxa"/>
@@ -2570,8 +2175,6 @@
               <w:rPr>
                 <w:b/>
                 <w:bCs/>
-                <w:sz w:val="22"/>
-                <w:szCs w:val="22"/>
               </w:rPr>
               <w:t>Agent action</w:t>
             </w:r>
@@ -2579,12 +2182,6 @@
         </w:tc>
       </w:tr>
       <w:tr>
-        <w:tblPrEx>
-          <w:tblCellMar>
-            <w:top w:w="0" w:type="dxa"/>
-            <w:bottom w:w="0" w:type="dxa"/>
-          </w:tblCellMar>
-        </w:tblPrEx>
         <w:trPr>
           <w:cantSplit/>
         </w:trPr>
@@ -2634,12 +2231,6 @@
         </w:tc>
       </w:tr>
       <w:tr>
-        <w:tblPrEx>
-          <w:tblCellMar>
-            <w:top w:w="0" w:type="dxa"/>
-            <w:bottom w:w="0" w:type="dxa"/>
-          </w:tblCellMar>
-        </w:tblPrEx>
         <w:trPr>
           <w:cantSplit/>
         </w:trPr>
@@ -2689,12 +2280,6 @@
         </w:tc>
       </w:tr>
       <w:tr>
-        <w:tblPrEx>
-          <w:tblCellMar>
-            <w:top w:w="0" w:type="dxa"/>
-            <w:bottom w:w="0" w:type="dxa"/>
-          </w:tblCellMar>
-        </w:tblPrEx>
         <w:trPr>
           <w:cantSplit/>
         </w:trPr>
@@ -2715,23 +2300,11 @@
             </w:tcMar>
           </w:tcPr>
           <w:p>
-            <w:proofErr w:type="spellStart"/>
             <w:r>
               <w:rPr>
-                <w:rFonts w:ascii="Courier New" w:eastAsia="Courier New" w:hAnsi="Courier New" w:cs="Courier New"/>
-                <w:sz w:val="22"/>
-                <w:szCs w:val="22"/>
+                <w:rFonts w:eastAsia="Courier New"/>
               </w:rPr>
-              <w:t>iteration_count</w:t>
-            </w:r>
-            <w:proofErr w:type="spellEnd"/>
-            <w:r>
-              <w:rPr>
-                <w:rFonts w:ascii="Courier New" w:eastAsia="Courier New" w:hAnsi="Courier New" w:cs="Courier New"/>
-                <w:sz w:val="22"/>
-                <w:szCs w:val="22"/>
-              </w:rPr>
-              <w:t xml:space="preserve"> &gt;= 3</w:t>
+              <w:t>iteration_count &gt;= 3</w:t>
             </w:r>
           </w:p>
         </w:tc>
@@ -2759,12 +2332,6 @@
         </w:tc>
       </w:tr>
       <w:tr>
-        <w:tblPrEx>
-          <w:tblCellMar>
-            <w:top w:w="0" w:type="dxa"/>
-            <w:bottom w:w="0" w:type="dxa"/>
-          </w:tblCellMar>
-        </w:tblPrEx>
         <w:trPr>
           <w:cantSplit/>
         </w:trPr>
@@ -2814,12 +2381,6 @@
         </w:tc>
       </w:tr>
       <w:tr>
-        <w:tblPrEx>
-          <w:tblCellMar>
-            <w:top w:w="0" w:type="dxa"/>
-            <w:bottom w:w="0" w:type="dxa"/>
-          </w:tblCellMar>
-        </w:tblPrEx>
         <w:trPr>
           <w:cantSplit/>
         </w:trPr>
@@ -2869,12 +2430,6 @@
         </w:tc>
       </w:tr>
       <w:tr>
-        <w:tblPrEx>
-          <w:tblCellMar>
-            <w:top w:w="0" w:type="dxa"/>
-            <w:bottom w:w="0" w:type="dxa"/>
-          </w:tblCellMar>
-        </w:tblPrEx>
         <w:trPr>
           <w:cantSplit/>
         </w:trPr>
@@ -2924,12 +2479,6 @@
         </w:tc>
       </w:tr>
       <w:tr>
-        <w:tblPrEx>
-          <w:tblCellMar>
-            <w:top w:w="0" w:type="dxa"/>
-            <w:bottom w:w="0" w:type="dxa"/>
-          </w:tblCellMar>
-        </w:tblPrEx>
         <w:trPr>
           <w:cantSplit/>
         </w:trPr>
@@ -2973,21 +2522,12 @@
           </w:tcPr>
           <w:p>
             <w:r>
-              <w:t>Safe</w:t>
-            </w:r>
-            <w:r>
-              <w:t>ty stop + human hand-off</w:t>
+              <w:t>Safety stop + human hand-off</w:t>
             </w:r>
           </w:p>
         </w:tc>
       </w:tr>
       <w:tr>
-        <w:tblPrEx>
-          <w:tblCellMar>
-            <w:top w:w="0" w:type="dxa"/>
-            <w:bottom w:w="0" w:type="dxa"/>
-          </w:tblCellMar>
-        </w:tblPrEx>
         <w:trPr>
           <w:cantSplit/>
         </w:trPr>
@@ -3037,12 +2577,6 @@
         </w:tc>
       </w:tr>
       <w:tr>
-        <w:tblPrEx>
-          <w:tblCellMar>
-            <w:top w:w="0" w:type="dxa"/>
-            <w:bottom w:w="0" w:type="dxa"/>
-          </w:tblCellMar>
-        </w:tblPrEx>
         <w:trPr>
           <w:cantSplit/>
         </w:trPr>
@@ -3092,28 +2626,38 @@
         </w:tc>
       </w:tr>
     </w:tbl>
-    <w:p>
-      <w:pPr>
-        <w:spacing w:after="100"/>
-      </w:pPr>
-    </w:p>
-    <w:p>
-      <w:pPr>
-        <w:pStyle w:val="Heading1"/>
-        <w:keepNext/>
-        <w:spacing w:before="240" w:after="120"/>
-      </w:pPr>
-      <w:r>
-        <w:t>6. Bounded Workflow: Sense → Plan → Act → Observe → Stop</w:t>
-      </w:r>
-    </w:p>
-    <w:p>
-      <w:pPr>
-        <w:pStyle w:val="Heading2"/>
-        <w:keepNext/>
-        <w:spacing w:before="180" w:after="80"/>
-      </w:pPr>
-      <w:r>
+    <w:p/>
+    <w:p>
+      <w:pPr>
+        <w:rPr>
+          <w:b/>
+        </w:rPr>
+      </w:pPr>
+      <w:r>
+        <w:rPr>
+          <w:b/>
+        </w:rPr>
+        <w:t xml:space="preserve">6. Bounded Workflow: </w:t>
+      </w:r>
+    </w:p>
+    <w:p>
+      <w:pPr>
+        <w:rPr>
+          <w:b/>
+        </w:rPr>
+      </w:pPr>
+    </w:p>
+    <w:p>
+      <w:r>
+        <w:t>Sense → Plan → Act → Observe → Stop</w:t>
+      </w:r>
+    </w:p>
+    <w:p/>
+    <w:p>
+      <w:r>
+        <w:rPr>
+          <w:b/>
+        </w:rPr>
         <w:t>6.1 Sense (Context Gathering)</w:t>
       </w:r>
     </w:p>
@@ -3122,7 +2666,7 @@
         <w:pStyle w:val="ListParagraph"/>
         <w:numPr>
           <w:ilvl w:val="0"/>
-          <w:numId w:val="5"/>
+          <w:numId w:val="10"/>
         </w:numPr>
       </w:pPr>
       <w:r>
@@ -3134,7 +2678,7 @@
         <w:pStyle w:val="ListParagraph"/>
         <w:numPr>
           <w:ilvl w:val="0"/>
-          <w:numId w:val="5"/>
+          <w:numId w:val="10"/>
         </w:numPr>
       </w:pPr>
       <w:r>
@@ -3146,7 +2690,7 @@
         <w:pStyle w:val="ListParagraph"/>
         <w:numPr>
           <w:ilvl w:val="0"/>
-          <w:numId w:val="5"/>
+          <w:numId w:val="10"/>
         </w:numPr>
       </w:pPr>
       <w:r>
@@ -3158,20 +2702,24 @@
         <w:pStyle w:val="ListParagraph"/>
         <w:numPr>
           <w:ilvl w:val="0"/>
-          <w:numId w:val="5"/>
+          <w:numId w:val="10"/>
         </w:numPr>
       </w:pPr>
       <w:r>
         <w:t>Determine if sufficient evidence exists.</w:t>
       </w:r>
     </w:p>
-    <w:p>
-      <w:pPr>
-        <w:pStyle w:val="Heading2"/>
-        <w:keepNext/>
-        <w:spacing w:before="180" w:after="80"/>
-      </w:pPr>
-      <w:r>
+    <w:p/>
+    <w:p>
+      <w:pPr>
+        <w:rPr>
+          <w:b/>
+        </w:rPr>
+      </w:pPr>
+      <w:r>
+        <w:rPr>
+          <w:b/>
+        </w:rPr>
         <w:t>6.2 Plan (Decision Making)</w:t>
       </w:r>
     </w:p>
@@ -3180,7 +2728,7 @@
         <w:pStyle w:val="ListParagraph"/>
         <w:numPr>
           <w:ilvl w:val="0"/>
-          <w:numId w:val="6"/>
+          <w:numId w:val="10"/>
         </w:numPr>
       </w:pPr>
       <w:r>
@@ -3192,7 +2740,7 @@
         <w:pStyle w:val="ListParagraph"/>
         <w:numPr>
           <w:ilvl w:val="0"/>
-          <w:numId w:val="6"/>
+          <w:numId w:val="10"/>
         </w:numPr>
       </w:pPr>
       <w:r>
@@ -3204,7 +2752,7 @@
         <w:pStyle w:val="ListParagraph"/>
         <w:numPr>
           <w:ilvl w:val="0"/>
-          <w:numId w:val="6"/>
+          <w:numId w:val="10"/>
         </w:numPr>
       </w:pPr>
       <w:r>
@@ -3216,20 +2764,24 @@
         <w:pStyle w:val="ListParagraph"/>
         <w:numPr>
           <w:ilvl w:val="0"/>
-          <w:numId w:val="6"/>
+          <w:numId w:val="10"/>
         </w:numPr>
       </w:pPr>
       <w:r>
         <w:t>Check if clarification is required.</w:t>
       </w:r>
     </w:p>
-    <w:p>
-      <w:pPr>
-        <w:pStyle w:val="Heading2"/>
-        <w:keepNext/>
-        <w:spacing w:before="180" w:after="80"/>
-      </w:pPr>
-      <w:r>
+    <w:p/>
+    <w:p>
+      <w:pPr>
+        <w:rPr>
+          <w:b/>
+        </w:rPr>
+      </w:pPr>
+      <w:r>
+        <w:rPr>
+          <w:b/>
+        </w:rPr>
         <w:t>6.3 Act (Tool Execution)</w:t>
       </w:r>
     </w:p>
@@ -3238,14 +2790,11 @@
         <w:pStyle w:val="ListParagraph"/>
         <w:numPr>
           <w:ilvl w:val="0"/>
-          <w:numId w:val="7"/>
+          <w:numId w:val="10"/>
         </w:numPr>
       </w:pPr>
       <w:r>
-        <w:t xml:space="preserve">Execute approved tool calls through </w:t>
-      </w:r>
-      <w:r>
-        <w:t>the orchestrator.</w:t>
+        <w:t>Execute approved tool calls through the orchestrator.</w:t>
       </w:r>
     </w:p>
     <w:p>
@@ -3253,7 +2802,7 @@
         <w:pStyle w:val="ListParagraph"/>
         <w:numPr>
           <w:ilvl w:val="0"/>
-          <w:numId w:val="7"/>
+          <w:numId w:val="10"/>
         </w:numPr>
       </w:pPr>
       <w:r>
@@ -3265,7 +2814,7 @@
         <w:pStyle w:val="ListParagraph"/>
         <w:numPr>
           <w:ilvl w:val="0"/>
-          <w:numId w:val="7"/>
+          <w:numId w:val="10"/>
         </w:numPr>
       </w:pPr>
       <w:r>
@@ -3277,20 +2826,24 @@
         <w:pStyle w:val="ListParagraph"/>
         <w:numPr>
           <w:ilvl w:val="0"/>
-          <w:numId w:val="7"/>
+          <w:numId w:val="10"/>
         </w:numPr>
       </w:pPr>
       <w:r>
         <w:t>Capture tool results for observation.</w:t>
       </w:r>
     </w:p>
-    <w:p>
-      <w:pPr>
-        <w:pStyle w:val="Heading2"/>
-        <w:keepNext/>
-        <w:spacing w:before="180" w:after="80"/>
-      </w:pPr>
-      <w:r>
+    <w:p/>
+    <w:p>
+      <w:pPr>
+        <w:rPr>
+          <w:b/>
+        </w:rPr>
+      </w:pPr>
+      <w:r>
+        <w:rPr>
+          <w:b/>
+        </w:rPr>
         <w:t>6.4 Observe (Result Assessment)</w:t>
       </w:r>
     </w:p>
@@ -3299,7 +2852,7 @@
         <w:pStyle w:val="ListParagraph"/>
         <w:numPr>
           <w:ilvl w:val="0"/>
-          <w:numId w:val="8"/>
+          <w:numId w:val="10"/>
         </w:numPr>
       </w:pPr>
       <w:r>
@@ -3311,47 +2864,11 @@
         <w:pStyle w:val="ListParagraph"/>
         <w:numPr>
           <w:ilvl w:val="0"/>
-          <w:numId w:val="8"/>
+          <w:numId w:val="10"/>
         </w:numPr>
       </w:pPr>
       <w:r>
         <w:t>Determine if the goal is achieved:</w:t>
-      </w:r>
-    </w:p>
-    <w:p>
-      <w:pPr>
-        <w:pStyle w:val="ListParagraph"/>
-        <w:numPr>
-          <w:ilvl w:val="1"/>
-          <w:numId w:val="3"/>
-        </w:numPr>
-      </w:pPr>
-      <w:r>
-        <w:t>Outage status checked for outage-related issues.</w:t>
-      </w:r>
-    </w:p>
-    <w:p>
-      <w:pPr>
-        <w:pStyle w:val="ListParagraph"/>
-        <w:numPr>
-          <w:ilvl w:val="1"/>
-          <w:numId w:val="3"/>
-        </w:numPr>
-      </w:pPr>
-      <w:r>
-        <w:t>Ticket drafted for issues requiring follow-up.</w:t>
-      </w:r>
-    </w:p>
-    <w:p>
-      <w:pPr>
-        <w:pStyle w:val="ListParagraph"/>
-        <w:numPr>
-          <w:ilvl w:val="1"/>
-          <w:numId w:val="3"/>
-        </w:numPr>
-      </w:pPr>
-      <w:r>
-        <w:t>Grounded guidance provided.</w:t>
       </w:r>
     </w:p>
     <w:p>
@@ -3359,11 +2876,11 @@
         <w:pStyle w:val="ListParagraph"/>
         <w:numPr>
           <w:ilvl w:val="0"/>
-          <w:numId w:val="8"/>
+          <w:numId w:val="10"/>
         </w:numPr>
       </w:pPr>
       <w:r>
-        <w:t>Check if human hand-off is needed.</w:t>
+        <w:t>Outage status checked for outage-related issues.</w:t>
       </w:r>
     </w:p>
     <w:p>
@@ -3371,21 +2888,11 @@
         <w:pStyle w:val="ListParagraph"/>
         <w:numPr>
           <w:ilvl w:val="0"/>
-          <w:numId w:val="8"/>
+          <w:numId w:val="10"/>
         </w:numPr>
       </w:pPr>
       <w:r>
-        <w:t>Determine if re-planning is necessary.</w:t>
-      </w:r>
-    </w:p>
-    <w:p>
-      <w:pPr>
-        <w:pStyle w:val="Heading2"/>
-        <w:keepNext/>
-        <w:spacing w:before="180" w:after="80"/>
-      </w:pPr>
-      <w:r>
-        <w:t>6.5 Stop/Re-plan (Termination Decision)</w:t>
+        <w:t>Ticket drafted for issues requiring follow-up.</w:t>
       </w:r>
     </w:p>
     <w:p>
@@ -3393,21 +2900,11 @@
         <w:pStyle w:val="ListParagraph"/>
         <w:numPr>
           <w:ilvl w:val="0"/>
-          <w:numId w:val="3"/>
+          <w:numId w:val="10"/>
         </w:numPr>
       </w:pPr>
       <w:r>
-        <w:rPr>
-          <w:b/>
-          <w:bCs/>
-        </w:rPr>
-        <w:t>Stop conditions:</w:t>
-      </w:r>
-      <w:r>
-        <w:t xml:space="preserve"> G</w:t>
-      </w:r>
-      <w:r>
-        <w:t>oal achieved, iteration limit reached, clarification required, or tool failure.</w:t>
+        <w:t>Grounded guidance provided.</w:t>
       </w:r>
     </w:p>
     <w:p>
@@ -3415,52 +2912,11 @@
         <w:pStyle w:val="ListParagraph"/>
         <w:numPr>
           <w:ilvl w:val="0"/>
-          <w:numId w:val="3"/>
+          <w:numId w:val="10"/>
         </w:numPr>
       </w:pPr>
       <w:r>
-        <w:rPr>
-          <w:b/>
-          <w:bCs/>
-        </w:rPr>
-        <w:t>Re-plan conditions:</w:t>
-      </w:r>
-      <w:r>
-        <w:t xml:space="preserve"> Tool results indicate a need for additional steps (e.g., outage found → provide guidance → draft ticket).</w:t>
-      </w:r>
-    </w:p>
-    <w:p>
-      <w:pPr>
-        <w:pStyle w:val="Heading1"/>
-        <w:keepNext/>
-        <w:spacing w:before="240" w:after="120"/>
-      </w:pPr>
-      <w:r>
-        <w:t>7. Re-planning Constraints</w:t>
-      </w:r>
-    </w:p>
-    <w:p>
-      <w:pPr>
-        <w:spacing w:after="100"/>
-      </w:pPr>
-      <w:r>
-        <w:t>Re-planning is permitte</w:t>
-      </w:r>
-      <w:r>
-        <w:t>d only when the new step is directly supported by the current state and the allowed tool set. The agent cannot introduce a new objective during re-planning.</w:t>
-      </w:r>
-    </w:p>
-    <w:p>
-      <w:pPr>
-        <w:keepNext/>
-        <w:spacing w:after="100"/>
-      </w:pPr>
-      <w:r>
-        <w:rPr>
-          <w:b/>
-          <w:bCs/>
-        </w:rPr>
-        <w:t>Examples:</w:t>
+        <w:t>Check if human hand-off is needed.</w:t>
       </w:r>
     </w:p>
     <w:p>
@@ -3468,49 +2924,109 @@
         <w:pStyle w:val="ListParagraph"/>
         <w:numPr>
           <w:ilvl w:val="0"/>
-          <w:numId w:val="3"/>
+          <w:numId w:val="10"/>
         </w:numPr>
       </w:pPr>
       <w:r>
+        <w:t>Determine if re-planning is necessary.</w:t>
+      </w:r>
+    </w:p>
+    <w:p/>
+    <w:p>
+      <w:pPr>
+        <w:rPr>
+          <w:b/>
+        </w:rPr>
+      </w:pPr>
+      <w:r>
+        <w:rPr>
+          <w:b/>
+        </w:rPr>
+        <w:t>6.5 Stop/Re-plan (Termination Decision)</w:t>
+      </w:r>
+    </w:p>
+    <w:p>
+      <w:r>
         <w:rPr>
           <w:b/>
           <w:bCs/>
         </w:rPr>
+        <w:t>Stop conditions:</w:t>
+      </w:r>
+      <w:r>
+        <w:t xml:space="preserve"> Goal achieved, iteration limit reached, clarification required, or tool failure.</w:t>
+      </w:r>
+    </w:p>
+    <w:p>
+      <w:r>
+        <w:rPr>
+          <w:b/>
+          <w:bCs/>
+        </w:rPr>
+        <w:t>Re-plan conditions:</w:t>
+      </w:r>
+      <w:r>
+        <w:t xml:space="preserve"> Tool results indicate a need for additional steps (e.g., outage found → provide guidance → draft ticket).</w:t>
+      </w:r>
+    </w:p>
+    <w:p/>
+    <w:p>
+      <w:pPr>
+        <w:rPr>
+          <w:b/>
+        </w:rPr>
+      </w:pPr>
+      <w:r>
+        <w:rPr>
+          <w:b/>
+        </w:rPr>
+        <w:t>7. Re-planning Constraints</w:t>
+      </w:r>
+    </w:p>
+    <w:p>
+      <w:r>
+        <w:t>Re-planning is permitted only when the new step is directly supported by the current state and the allowed tool set. The agent cannot introduce a new objective during re-planning.</w:t>
+      </w:r>
+    </w:p>
+    <w:p>
+      <w:pPr>
+        <w:rPr>
+          <w:b/>
+          <w:bCs/>
+        </w:rPr>
+      </w:pPr>
+    </w:p>
+    <w:p>
+      <w:r>
+        <w:rPr>
+          <w:b/>
+          <w:bCs/>
+        </w:rPr>
+        <w:t>Examples:</w:t>
+      </w:r>
+    </w:p>
+    <w:p>
+      <w:r>
+        <w:rPr>
+          <w:b/>
+          <w:bCs/>
+        </w:rPr>
         <w:t>Valid re-plan:</w:t>
       </w:r>
       <w:r>
         <w:t xml:space="preserve"> After </w:t>
       </w:r>
-      <w:proofErr w:type="spellStart"/>
-      <w:r>
-        <w:rPr>
-          <w:rFonts w:ascii="Courier New" w:eastAsia="Courier New" w:hAnsi="Courier New" w:cs="Courier New"/>
-          <w:sz w:val="22"/>
-          <w:szCs w:val="22"/>
+      <w:r>
+        <w:rPr>
+          <w:rFonts w:eastAsia="Courier New"/>
         </w:rPr>
         <w:t>get_outage_status</w:t>
       </w:r>
-      <w:proofErr w:type="spellEnd"/>
-      <w:r>
-        <w:t xml:space="preserve"> returns an active </w:t>
-      </w:r>
-      <w:proofErr w:type="gramStart"/>
-      <w:r>
-        <w:t>outage,</w:t>
-      </w:r>
-      <w:proofErr w:type="gramEnd"/>
-      <w:r>
-        <w:t xml:space="preserve"> the agent may proceed to provide guidance and draft a ticket.</w:t>
-      </w:r>
-    </w:p>
-    <w:p>
-      <w:pPr>
-        <w:pStyle w:val="ListParagraph"/>
-        <w:numPr>
-          <w:ilvl w:val="0"/>
-          <w:numId w:val="3"/>
-        </w:numPr>
-      </w:pPr>
+      <w:r>
+        <w:t xml:space="preserve"> returns an active outage, the agent may proceed to provide guidance and draft a ticket.</w:t>
+      </w:r>
+    </w:p>
+    <w:p>
       <w:r>
         <w:rPr>
           <w:b/>
@@ -3523,22 +3039,11 @@
       </w:r>
     </w:p>
     <w:p>
-      <w:pPr>
-        <w:spacing w:after="100"/>
-      </w:pPr>
-      <w:r>
-        <w:t>This constraint ens</w:t>
-      </w:r>
-      <w:r>
-        <w:t>ures the agent remains bounded to its original triage objective and cannot autonomously expand its scope.</w:t>
-      </w:r>
-    </w:p>
-    <w:p>
-      <w:pPr>
-        <w:pStyle w:val="ListParagraph"/>
-        <w:ind w:left="720"/>
-      </w:pPr>
-    </w:p>
+      <w:r>
+        <w:t>This constraint ensures the agent remains bounded to its original triage objective and cannot autonomously expand its scope.</w:t>
+      </w:r>
+    </w:p>
+    <w:p/>
     <w:sectPr>
       <w:pgSz w:w="12240" w:h="15840"/>
       <w:pgMar w:top="1440" w:right="1440" w:bottom="1440" w:left="1440" w:header="708" w:footer="708" w:gutter="0"/>
@@ -3550,7 +3055,7 @@
 </file>
 
 <file path=word/numbering.xml><?xml version="1.0" encoding="utf-8"?>
-<w:numbering xmlns:wpc="http://schemas.microsoft.com/office/word/2010/wordprocessingCanvas" xmlns:cx="http://schemas.microsoft.com/office/drawing/2014/chartex" xmlns:cx1="http://schemas.microsoft.com/office/drawing/2015/9/8/chartex" xmlns:cx2="http://schemas.microsoft.com/office/drawing/2015/10/21/chartex" xmlns:cx3="http://schemas.microsoft.com/office/drawing/2016/5/9/chartex" xmlns:cx4="http://schemas.microsoft.com/office/drawing/2016/5/10/chartex" xmlns:cx5="http://schemas.microsoft.com/office/drawing/2016/5/11/chartex" xmlns:cx6="http://schemas.microsoft.com/office/drawing/2016/5/12/chartex" xmlns:cx7="http://schemas.microsoft.com/office/drawing/2016/5/13/chartex" xmlns:cx8="http://schemas.microsoft.com/office/drawing/2016/5/14/chartex" xmlns:mc="http://schemas.openxmlformats.org/markup-compatibility/2006" xmlns:aink="http://schemas.microsoft.com/office/drawing/2016/ink" xmlns:am3d="http://schemas.microsoft.com/office/drawing/2017/model3d" xmlns:o="urn:schemas-microsoft-com:office:office" xmlns:r="http://schemas.openxmlformats.org/officeDocument/2006/relationships" xmlns:m="http://schemas.openxmlformats.org/officeDocument/2006/math" xmlns:v="urn:schemas-microsoft-com:vml" xmlns:wp14="http://schemas.microsoft.com/office/word/2010/wordprocessingDrawing" xmlns:wp="http://schemas.openxmlformats.org/drawingml/2006/wordprocessingDrawing" xmlns:w10="urn:schemas-microsoft-com:office:word" xmlns:w="http://schemas.openxmlformats.org/wordprocessingml/2006/main" xmlns:w14="http://schemas.microsoft.com/office/word/2010/wordml" xmlns:w15="http://schemas.microsoft.com/office/word/2012/wordml" xmlns:w16cex="http://schemas.microsoft.com/office/word/2018/wordml/cex" xmlns:w16cid="http://schemas.microsoft.com/office/word/2016/wordml/cid" xmlns:w16="http://schemas.microsoft.com/office/word/2018/wordml" xmlns:w16sdtdh="http://schemas.microsoft.com/office/word/2020/wordml/sdtdatahash" xmlns:w16se="http://schemas.microsoft.com/office/word/2015/wordml/symex" xmlns:wpg="http://schemas.microsoft.com/office/word/2010/wordprocessingGroup" xmlns:wpi="http://schemas.microsoft.com/office/word/2010/wordprocessingInk" xmlns:wne="http://schemas.microsoft.com/office/word/2006/wordml" xmlns:wps="http://schemas.microsoft.com/office/word/2010/wordprocessingShape" mc:Ignorable="w14 w15 w16se w16cid w16 w16cex w16sdtdh wp14">
+<w:numbering xmlns:wpc="http://schemas.microsoft.com/office/word/2010/wordprocessingCanvas" xmlns:cx="http://schemas.microsoft.com/office/drawing/2014/chartex" xmlns:cx1="http://schemas.microsoft.com/office/drawing/2015/9/8/chartex" xmlns:mc="http://schemas.openxmlformats.org/markup-compatibility/2006" xmlns:o="urn:schemas-microsoft-com:office:office" xmlns:r="http://schemas.openxmlformats.org/officeDocument/2006/relationships" xmlns:m="http://schemas.openxmlformats.org/officeDocument/2006/math" xmlns:v="urn:schemas-microsoft-com:vml" xmlns:wp14="http://schemas.microsoft.com/office/word/2010/wordprocessingDrawing" xmlns:wp="http://schemas.openxmlformats.org/drawingml/2006/wordprocessingDrawing" xmlns:w10="urn:schemas-microsoft-com:office:word" xmlns:w="http://schemas.openxmlformats.org/wordprocessingml/2006/main" xmlns:w14="http://schemas.microsoft.com/office/word/2010/wordml" xmlns:w15="http://schemas.microsoft.com/office/word/2012/wordml" xmlns:w16se="http://schemas.microsoft.com/office/word/2015/wordml/symex" xmlns:wpg="http://schemas.microsoft.com/office/word/2010/wordprocessingGroup" xmlns:wpi="http://schemas.microsoft.com/office/word/2010/wordprocessingInk" xmlns:wne="http://schemas.microsoft.com/office/word/2006/wordml" xmlns:wps="http://schemas.microsoft.com/office/word/2010/wordprocessingShape" mc:Ignorable="w14 w15 w16se wp14">
   <w:abstractNum w:abstractNumId="0" w15:restartNumberingAfterBreak="0">
     <w:nsid w:val="053F6F65"/>
     <w:multiLevelType w:val="hybridMultilevel"/>
@@ -3804,6 +3309,119 @@
     </w:lvl>
   </w:abstractNum>
   <w:abstractNum w:abstractNumId="4" w15:restartNumberingAfterBreak="0">
+    <w:nsid w:val="1E765A25"/>
+    <w:multiLevelType w:val="hybridMultilevel"/>
+    <w:tmpl w:val="F2368EE0"/>
+    <w:lvl w:ilvl="0" w:tplc="0809000B">
+      <w:start w:val="1"/>
+      <w:numFmt w:val="bullet"/>
+      <w:lvlText w:val=""/>
+      <w:lvlJc w:val="left"/>
+      <w:pPr>
+        <w:ind w:left="720" w:hanging="360"/>
+      </w:pPr>
+      <w:rPr>
+        <w:rFonts w:ascii="Wingdings" w:hAnsi="Wingdings" w:hint="default"/>
+      </w:rPr>
+    </w:lvl>
+    <w:lvl w:ilvl="1" w:tplc="400A0003" w:tentative="1">
+      <w:start w:val="1"/>
+      <w:numFmt w:val="bullet"/>
+      <w:lvlText w:val="o"/>
+      <w:lvlJc w:val="left"/>
+      <w:pPr>
+        <w:ind w:left="1440" w:hanging="360"/>
+      </w:pPr>
+      <w:rPr>
+        <w:rFonts w:ascii="Courier New" w:hAnsi="Courier New" w:cs="Courier New" w:hint="default"/>
+      </w:rPr>
+    </w:lvl>
+    <w:lvl w:ilvl="2" w:tplc="400A0005" w:tentative="1">
+      <w:start w:val="1"/>
+      <w:numFmt w:val="bullet"/>
+      <w:lvlText w:val=""/>
+      <w:lvlJc w:val="left"/>
+      <w:pPr>
+        <w:ind w:left="2160" w:hanging="360"/>
+      </w:pPr>
+      <w:rPr>
+        <w:rFonts w:ascii="Wingdings" w:hAnsi="Wingdings" w:hint="default"/>
+      </w:rPr>
+    </w:lvl>
+    <w:lvl w:ilvl="3" w:tplc="400A0001" w:tentative="1">
+      <w:start w:val="1"/>
+      <w:numFmt w:val="bullet"/>
+      <w:lvlText w:val=""/>
+      <w:lvlJc w:val="left"/>
+      <w:pPr>
+        <w:ind w:left="2880" w:hanging="360"/>
+      </w:pPr>
+      <w:rPr>
+        <w:rFonts w:ascii="Symbol" w:hAnsi="Symbol" w:hint="default"/>
+      </w:rPr>
+    </w:lvl>
+    <w:lvl w:ilvl="4" w:tplc="400A0003" w:tentative="1">
+      <w:start w:val="1"/>
+      <w:numFmt w:val="bullet"/>
+      <w:lvlText w:val="o"/>
+      <w:lvlJc w:val="left"/>
+      <w:pPr>
+        <w:ind w:left="3600" w:hanging="360"/>
+      </w:pPr>
+      <w:rPr>
+        <w:rFonts w:ascii="Courier New" w:hAnsi="Courier New" w:cs="Courier New" w:hint="default"/>
+      </w:rPr>
+    </w:lvl>
+    <w:lvl w:ilvl="5" w:tplc="400A0005" w:tentative="1">
+      <w:start w:val="1"/>
+      <w:numFmt w:val="bullet"/>
+      <w:lvlText w:val=""/>
+      <w:lvlJc w:val="left"/>
+      <w:pPr>
+        <w:ind w:left="4320" w:hanging="360"/>
+      </w:pPr>
+      <w:rPr>
+        <w:rFonts w:ascii="Wingdings" w:hAnsi="Wingdings" w:hint="default"/>
+      </w:rPr>
+    </w:lvl>
+    <w:lvl w:ilvl="6" w:tplc="400A0001" w:tentative="1">
+      <w:start w:val="1"/>
+      <w:numFmt w:val="bullet"/>
+      <w:lvlText w:val=""/>
+      <w:lvlJc w:val="left"/>
+      <w:pPr>
+        <w:ind w:left="5040" w:hanging="360"/>
+      </w:pPr>
+      <w:rPr>
+        <w:rFonts w:ascii="Symbol" w:hAnsi="Symbol" w:hint="default"/>
+      </w:rPr>
+    </w:lvl>
+    <w:lvl w:ilvl="7" w:tplc="400A0003" w:tentative="1">
+      <w:start w:val="1"/>
+      <w:numFmt w:val="bullet"/>
+      <w:lvlText w:val="o"/>
+      <w:lvlJc w:val="left"/>
+      <w:pPr>
+        <w:ind w:left="5760" w:hanging="360"/>
+      </w:pPr>
+      <w:rPr>
+        <w:rFonts w:ascii="Courier New" w:hAnsi="Courier New" w:cs="Courier New" w:hint="default"/>
+      </w:rPr>
+    </w:lvl>
+    <w:lvl w:ilvl="8" w:tplc="400A0005" w:tentative="1">
+      <w:start w:val="1"/>
+      <w:numFmt w:val="bullet"/>
+      <w:lvlText w:val=""/>
+      <w:lvlJc w:val="left"/>
+      <w:pPr>
+        <w:ind w:left="6480" w:hanging="360"/>
+      </w:pPr>
+      <w:rPr>
+        <w:rFonts w:ascii="Wingdings" w:hAnsi="Wingdings" w:hint="default"/>
+      </w:rPr>
+    </w:lvl>
+  </w:abstractNum>
+  <w:abstractNum w:abstractNumId="5" w15:restartNumberingAfterBreak="0">
     <w:nsid w:val="490F0A5A"/>
     <w:multiLevelType w:val="hybridMultilevel"/>
     <w:tmpl w:val="A4D28268"/>
@@ -3857,7 +3475,7 @@
       <w:lvlJc w:val="left"/>
     </w:lvl>
   </w:abstractNum>
-  <w:abstractNum w:abstractNumId="5" w15:restartNumberingAfterBreak="0">
+  <w:abstractNum w:abstractNumId="6" w15:restartNumberingAfterBreak="0">
     <w:nsid w:val="573B41AB"/>
     <w:multiLevelType w:val="hybridMultilevel"/>
     <w:tmpl w:val="23C81B0A"/>
@@ -3911,7 +3529,7 @@
       <w:lvlJc w:val="left"/>
     </w:lvl>
   </w:abstractNum>
-  <w:abstractNum w:abstractNumId="6" w15:restartNumberingAfterBreak="0">
+  <w:abstractNum w:abstractNumId="7" w15:restartNumberingAfterBreak="0">
     <w:nsid w:val="61320A9B"/>
     <w:multiLevelType w:val="hybridMultilevel"/>
     <w:tmpl w:val="279E2DDA"/>
@@ -3965,7 +3583,7 @@
       <w:lvlJc w:val="left"/>
     </w:lvl>
   </w:abstractNum>
-  <w:abstractNum w:abstractNumId="7" w15:restartNumberingAfterBreak="0">
+  <w:abstractNum w:abstractNumId="8" w15:restartNumberingAfterBreak="0">
     <w:nsid w:val="694001A7"/>
     <w:multiLevelType w:val="hybridMultilevel"/>
     <w:tmpl w:val="3C888634"/>
@@ -4017,6 +3635,232 @@
       <w:numFmt w:val="decimal"/>
       <w:lvlText w:val=""/>
       <w:lvlJc w:val="left"/>
+    </w:lvl>
+  </w:abstractNum>
+  <w:abstractNum w:abstractNumId="9" w15:restartNumberingAfterBreak="0">
+    <w:nsid w:val="714075B0"/>
+    <w:multiLevelType w:val="hybridMultilevel"/>
+    <w:tmpl w:val="77764D04"/>
+    <w:lvl w:ilvl="0" w:tplc="0809000D">
+      <w:start w:val="1"/>
+      <w:numFmt w:val="bullet"/>
+      <w:lvlText w:val=""/>
+      <w:lvlJc w:val="left"/>
+      <w:pPr>
+        <w:ind w:left="720" w:hanging="360"/>
+      </w:pPr>
+      <w:rPr>
+        <w:rFonts w:ascii="Wingdings" w:hAnsi="Wingdings" w:hint="default"/>
+      </w:rPr>
+    </w:lvl>
+    <w:lvl w:ilvl="1" w:tplc="400A0003" w:tentative="1">
+      <w:start w:val="1"/>
+      <w:numFmt w:val="bullet"/>
+      <w:lvlText w:val="o"/>
+      <w:lvlJc w:val="left"/>
+      <w:pPr>
+        <w:ind w:left="1440" w:hanging="360"/>
+      </w:pPr>
+      <w:rPr>
+        <w:rFonts w:ascii="Courier New" w:hAnsi="Courier New" w:cs="Courier New" w:hint="default"/>
+      </w:rPr>
+    </w:lvl>
+    <w:lvl w:ilvl="2" w:tplc="400A0005" w:tentative="1">
+      <w:start w:val="1"/>
+      <w:numFmt w:val="bullet"/>
+      <w:lvlText w:val=""/>
+      <w:lvlJc w:val="left"/>
+      <w:pPr>
+        <w:ind w:left="2160" w:hanging="360"/>
+      </w:pPr>
+      <w:rPr>
+        <w:rFonts w:ascii="Wingdings" w:hAnsi="Wingdings" w:hint="default"/>
+      </w:rPr>
+    </w:lvl>
+    <w:lvl w:ilvl="3" w:tplc="400A0001" w:tentative="1">
+      <w:start w:val="1"/>
+      <w:numFmt w:val="bullet"/>
+      <w:lvlText w:val=""/>
+      <w:lvlJc w:val="left"/>
+      <w:pPr>
+        <w:ind w:left="2880" w:hanging="360"/>
+      </w:pPr>
+      <w:rPr>
+        <w:rFonts w:ascii="Symbol" w:hAnsi="Symbol" w:hint="default"/>
+      </w:rPr>
+    </w:lvl>
+    <w:lvl w:ilvl="4" w:tplc="400A0003" w:tentative="1">
+      <w:start w:val="1"/>
+      <w:numFmt w:val="bullet"/>
+      <w:lvlText w:val="o"/>
+      <w:lvlJc w:val="left"/>
+      <w:pPr>
+        <w:ind w:left="3600" w:hanging="360"/>
+      </w:pPr>
+      <w:rPr>
+        <w:rFonts w:ascii="Courier New" w:hAnsi="Courier New" w:cs="Courier New" w:hint="default"/>
+      </w:rPr>
+    </w:lvl>
+    <w:lvl w:ilvl="5" w:tplc="400A0005" w:tentative="1">
+      <w:start w:val="1"/>
+      <w:numFmt w:val="bullet"/>
+      <w:lvlText w:val=""/>
+      <w:lvlJc w:val="left"/>
+      <w:pPr>
+        <w:ind w:left="4320" w:hanging="360"/>
+      </w:pPr>
+      <w:rPr>
+        <w:rFonts w:ascii="Wingdings" w:hAnsi="Wingdings" w:hint="default"/>
+      </w:rPr>
+    </w:lvl>
+    <w:lvl w:ilvl="6" w:tplc="400A0001" w:tentative="1">
+      <w:start w:val="1"/>
+      <w:numFmt w:val="bullet"/>
+      <w:lvlText w:val=""/>
+      <w:lvlJc w:val="left"/>
+      <w:pPr>
+        <w:ind w:left="5040" w:hanging="360"/>
+      </w:pPr>
+      <w:rPr>
+        <w:rFonts w:ascii="Symbol" w:hAnsi="Symbol" w:hint="default"/>
+      </w:rPr>
+    </w:lvl>
+    <w:lvl w:ilvl="7" w:tplc="400A0003" w:tentative="1">
+      <w:start w:val="1"/>
+      <w:numFmt w:val="bullet"/>
+      <w:lvlText w:val="o"/>
+      <w:lvlJc w:val="left"/>
+      <w:pPr>
+        <w:ind w:left="5760" w:hanging="360"/>
+      </w:pPr>
+      <w:rPr>
+        <w:rFonts w:ascii="Courier New" w:hAnsi="Courier New" w:cs="Courier New" w:hint="default"/>
+      </w:rPr>
+    </w:lvl>
+    <w:lvl w:ilvl="8" w:tplc="400A0005" w:tentative="1">
+      <w:start w:val="1"/>
+      <w:numFmt w:val="bullet"/>
+      <w:lvlText w:val=""/>
+      <w:lvlJc w:val="left"/>
+      <w:pPr>
+        <w:ind w:left="6480" w:hanging="360"/>
+      </w:pPr>
+      <w:rPr>
+        <w:rFonts w:ascii="Wingdings" w:hAnsi="Wingdings" w:hint="default"/>
+      </w:rPr>
+    </w:lvl>
+  </w:abstractNum>
+  <w:abstractNum w:abstractNumId="10" w15:restartNumberingAfterBreak="0">
+    <w:nsid w:val="78202F59"/>
+    <w:multiLevelType w:val="hybridMultilevel"/>
+    <w:tmpl w:val="2744BA1A"/>
+    <w:lvl w:ilvl="0" w:tplc="0809000D">
+      <w:start w:val="1"/>
+      <w:numFmt w:val="bullet"/>
+      <w:lvlText w:val=""/>
+      <w:lvlJc w:val="left"/>
+      <w:pPr>
+        <w:ind w:left="720" w:hanging="360"/>
+      </w:pPr>
+      <w:rPr>
+        <w:rFonts w:ascii="Wingdings" w:hAnsi="Wingdings" w:hint="default"/>
+      </w:rPr>
+    </w:lvl>
+    <w:lvl w:ilvl="1" w:tplc="400A0003" w:tentative="1">
+      <w:start w:val="1"/>
+      <w:numFmt w:val="bullet"/>
+      <w:lvlText w:val="o"/>
+      <w:lvlJc w:val="left"/>
+      <w:pPr>
+        <w:ind w:left="1440" w:hanging="360"/>
+      </w:pPr>
+      <w:rPr>
+        <w:rFonts w:ascii="Courier New" w:hAnsi="Courier New" w:cs="Courier New" w:hint="default"/>
+      </w:rPr>
+    </w:lvl>
+    <w:lvl w:ilvl="2" w:tplc="400A0005" w:tentative="1">
+      <w:start w:val="1"/>
+      <w:numFmt w:val="bullet"/>
+      <w:lvlText w:val=""/>
+      <w:lvlJc w:val="left"/>
+      <w:pPr>
+        <w:ind w:left="2160" w:hanging="360"/>
+      </w:pPr>
+      <w:rPr>
+        <w:rFonts w:ascii="Wingdings" w:hAnsi="Wingdings" w:hint="default"/>
+      </w:rPr>
+    </w:lvl>
+    <w:lvl w:ilvl="3" w:tplc="400A0001" w:tentative="1">
+      <w:start w:val="1"/>
+      <w:numFmt w:val="bullet"/>
+      <w:lvlText w:val=""/>
+      <w:lvlJc w:val="left"/>
+      <w:pPr>
+        <w:ind w:left="2880" w:hanging="360"/>
+      </w:pPr>
+      <w:rPr>
+        <w:rFonts w:ascii="Symbol" w:hAnsi="Symbol" w:hint="default"/>
+      </w:rPr>
+    </w:lvl>
+    <w:lvl w:ilvl="4" w:tplc="400A0003" w:tentative="1">
+      <w:start w:val="1"/>
+      <w:numFmt w:val="bullet"/>
+      <w:lvlText w:val="o"/>
+      <w:lvlJc w:val="left"/>
+      <w:pPr>
+        <w:ind w:left="3600" w:hanging="360"/>
+      </w:pPr>
+      <w:rPr>
+        <w:rFonts w:ascii="Courier New" w:hAnsi="Courier New" w:cs="Courier New" w:hint="default"/>
+      </w:rPr>
+    </w:lvl>
+    <w:lvl w:ilvl="5" w:tplc="400A0005" w:tentative="1">
+      <w:start w:val="1"/>
+      <w:numFmt w:val="bullet"/>
+      <w:lvlText w:val=""/>
+      <w:lvlJc w:val="left"/>
+      <w:pPr>
+        <w:ind w:left="4320" w:hanging="360"/>
+      </w:pPr>
+      <w:rPr>
+        <w:rFonts w:ascii="Wingdings" w:hAnsi="Wingdings" w:hint="default"/>
+      </w:rPr>
+    </w:lvl>
+    <w:lvl w:ilvl="6" w:tplc="400A0001" w:tentative="1">
+      <w:start w:val="1"/>
+      <w:numFmt w:val="bullet"/>
+      <w:lvlText w:val=""/>
+      <w:lvlJc w:val="left"/>
+      <w:pPr>
+        <w:ind w:left="5040" w:hanging="360"/>
+      </w:pPr>
+      <w:rPr>
+        <w:rFonts w:ascii="Symbol" w:hAnsi="Symbol" w:hint="default"/>
+      </w:rPr>
+    </w:lvl>
+    <w:lvl w:ilvl="7" w:tplc="400A0003" w:tentative="1">
+      <w:start w:val="1"/>
+      <w:numFmt w:val="bullet"/>
+      <w:lvlText w:val="o"/>
+      <w:lvlJc w:val="left"/>
+      <w:pPr>
+        <w:ind w:left="5760" w:hanging="360"/>
+      </w:pPr>
+      <w:rPr>
+        <w:rFonts w:ascii="Courier New" w:hAnsi="Courier New" w:cs="Courier New" w:hint="default"/>
+      </w:rPr>
+    </w:lvl>
+    <w:lvl w:ilvl="8" w:tplc="400A0005" w:tentative="1">
+      <w:start w:val="1"/>
+      <w:numFmt w:val="bullet"/>
+      <w:lvlText w:val=""/>
+      <w:lvlJc w:val="left"/>
+      <w:pPr>
+        <w:ind w:left="6480" w:hanging="360"/>
+      </w:pPr>
+      <w:rPr>
+        <w:rFonts w:ascii="Wingdings" w:hAnsi="Wingdings" w:hint="default"/>
+      </w:rPr>
     </w:lvl>
   </w:abstractNum>
   <w:num w:numId="1">
@@ -4026,7 +3870,7 @@
     </w:lvlOverride>
   </w:num>
   <w:num w:numId="2">
-    <w:abstractNumId w:val="5"/>
+    <w:abstractNumId w:val="6"/>
     <w:lvlOverride w:ilvl="0">
       <w:startOverride w:val="1"/>
     </w:lvlOverride>
@@ -4050,28 +3894,37 @@
     </w:lvlOverride>
   </w:num>
   <w:num w:numId="6">
+    <w:abstractNumId w:val="8"/>
+    <w:lvlOverride w:ilvl="0">
+      <w:startOverride w:val="1"/>
+    </w:lvlOverride>
+  </w:num>
+  <w:num w:numId="7">
     <w:abstractNumId w:val="7"/>
     <w:lvlOverride w:ilvl="0">
       <w:startOverride w:val="1"/>
     </w:lvlOverride>
   </w:num>
-  <w:num w:numId="7">
-    <w:abstractNumId w:val="6"/>
+  <w:num w:numId="8">
+    <w:abstractNumId w:val="5"/>
     <w:lvlOverride w:ilvl="0">
       <w:startOverride w:val="1"/>
     </w:lvlOverride>
   </w:num>
-  <w:num w:numId="8">
+  <w:num w:numId="9">
+    <w:abstractNumId w:val="9"/>
+  </w:num>
+  <w:num w:numId="10">
+    <w:abstractNumId w:val="10"/>
+  </w:num>
+  <w:num w:numId="11">
     <w:abstractNumId w:val="4"/>
-    <w:lvlOverride w:ilvl="0">
-      <w:startOverride w:val="1"/>
-    </w:lvlOverride>
   </w:num>
 </w:numbering>
 </file>
 
 <file path=word/styles.xml><?xml version="1.0" encoding="utf-8"?>
-<w:styles xmlns:mc="http://schemas.openxmlformats.org/markup-compatibility/2006" xmlns:r="http://schemas.openxmlformats.org/officeDocument/2006/relationships" xmlns:w="http://schemas.openxmlformats.org/wordprocessingml/2006/main" xmlns:w14="http://schemas.microsoft.com/office/word/2010/wordml" xmlns:w15="http://schemas.microsoft.com/office/word/2012/wordml" xmlns:w16cex="http://schemas.microsoft.com/office/word/2018/wordml/cex" xmlns:w16cid="http://schemas.microsoft.com/office/word/2016/wordml/cid" xmlns:w16="http://schemas.microsoft.com/office/word/2018/wordml" xmlns:w16sdtdh="http://schemas.microsoft.com/office/word/2020/wordml/sdtdatahash" xmlns:w16se="http://schemas.microsoft.com/office/word/2015/wordml/symex" mc:Ignorable="w14 w15 w16se w16cid w16 w16cex w16sdtdh">
+<w:styles xmlns:mc="http://schemas.openxmlformats.org/markup-compatibility/2006" xmlns:r="http://schemas.openxmlformats.org/officeDocument/2006/relationships" xmlns:w="http://schemas.openxmlformats.org/wordprocessingml/2006/main" xmlns:w14="http://schemas.microsoft.com/office/word/2010/wordml" xmlns:w15="http://schemas.microsoft.com/office/word/2012/wordml" xmlns:w16se="http://schemas.microsoft.com/office/word/2015/wordml/symex" mc:Ignorable="w14 w15 w16se">
   <w:docDefaults>
     <w:rPrDefault>
       <w:rPr>
@@ -4084,7 +3937,7 @@
     </w:rPrDefault>
     <w:pPrDefault/>
   </w:docDefaults>
-  <w:latentStyles w:defLockedState="0" w:defUIPriority="99" w:defSemiHidden="0" w:defUnhideWhenUsed="0" w:defQFormat="0" w:count="376">
+  <w:latentStyles w:defLockedState="0" w:defUIPriority="99" w:defSemiHidden="0" w:defUnhideWhenUsed="0" w:defQFormat="0" w:count="371">
     <w:lsdException w:name="Normal" w:uiPriority="0" w:qFormat="1"/>
     <w:lsdException w:name="heading 1" w:uiPriority="9" w:qFormat="1"/>
     <w:lsdException w:name="heading 2" w:semiHidden="1" w:uiPriority="9" w:unhideWhenUsed="1" w:qFormat="1"/>
@@ -4456,11 +4309,6 @@
     <w:lsdException w:name="List Table 5 Dark Accent 6" w:uiPriority="50"/>
     <w:lsdException w:name="List Table 6 Colorful Accent 6" w:uiPriority="51"/>
     <w:lsdException w:name="List Table 7 Colorful Accent 6" w:uiPriority="52"/>
-    <w:lsdException w:name="Mention" w:semiHidden="1" w:unhideWhenUsed="1"/>
-    <w:lsdException w:name="Smart Hyperlink" w:semiHidden="1" w:unhideWhenUsed="1"/>
-    <w:lsdException w:name="Hashtag" w:semiHidden="1" w:unhideWhenUsed="1"/>
-    <w:lsdException w:name="Unresolved Mention" w:semiHidden="1" w:unhideWhenUsed="1"/>
-    <w:lsdException w:name="Smart Link" w:semiHidden="1" w:unhideWhenUsed="1"/>
   </w:latentStyles>
   <w:style w:type="paragraph" w:default="1" w:styleId="Normal">
     <w:name w:val="Normal"/>

</xml_diff>